<commit_message>
Sync submission docx to the 2026-10-28 revision
Update the archived submission copies to the authoritative 2026-10-28 files:
- Manuscript: 1E4E00B37077C2A787E57D45BB9B8AD349F72202227FB3ED122E0BE794196703
- Supplementary: 4D7F1A82D3E3DBDC3A63979EA90E3630E4C4639BBBDED7D5558E946CF4BF0DC8
</commit_message>
<xml_diff>
--- a/supplementary/v14_submission/Manuscript_v14_Short_Rebalanced_REVISED.docx
+++ b/supplementary/v14_submission/Manuscript_v14_Short_Rebalanced_REVISED.docx
@@ -12,21 +12,12 @@
           <w:szCs w:val="21"/>
         </w:rPr>
       </w:pPr>
-      <w:proofErr w:type="spellStart"/>
       <w:r>
         <w:rPr>
           <w:sz w:val="21"/>
           <w:szCs w:val="21"/>
         </w:rPr>
-        <w:t>MedTrajectory</w:t>
-      </w:r>
-      <w:proofErr w:type="spellEnd"/>
-      <w:r>
-        <w:rPr>
-          <w:sz w:val="21"/>
-          <w:szCs w:val="21"/>
-        </w:rPr>
-        <w:t>: Forward Generation of Multitype Longitudinal Patient Trajectories</w:t>
+        <w:t>MedTrajectory: Forward Generation of Multitype Longitudinal Patient Trajectories</w:t>
       </w:r>
     </w:p>
     <w:p>
@@ -174,61 +165,86 @@
           <w:color w:val="000000"/>
           <w:lang w:eastAsia="zh-CN"/>
         </w:rPr>
-        <w:t xml:space="preserve">s, we develop </w:t>
-      </w:r>
-      <w:proofErr w:type="spellStart"/>
-      <w:r>
-        <w:rPr>
+        <w:t>s, we develop MedTrajectory, an autoregressive Transformer that integrates multitype clinical events through absolute age encoding and continuous relative-time attention. We evaluate the model primarily in UK Biobank and replicate the analyses in MIMIC-IV to probe cross-setting generalization. In this setting, multitype modeling improved several trajectory measures, while relative-time attention raised the locked-test Diagnosis Jaccard from 0.0572 to 0.0711 under the multitype-generation protocol, albeit with representation-dependent effects in MIMIC-IV. Finally, our death-event analyses underscore that trajectory termination and mortality-risk estimation are distinct targets, and the separate fixed-horizon risk evaluation in UK Biobank did not establish the prespecified noninferiority.</w:t>
+      </w:r>
+    </w:p>
+    <w:p>
+      <w:pPr>
+        <w:rPr>
+          <w:color w:val="000000"/>
+          <w:lang w:eastAsia="zh-CN"/>
+        </w:rPr>
+      </w:pPr>
+      <w:r>
+        <w:rPr>
+          <w:rFonts w:hint="eastAsia"/>
           <w:b/>
           <w:bCs/>
           <w:color w:val="000000"/>
           <w:lang w:eastAsia="zh-CN"/>
         </w:rPr>
-        <w:t>MedTrajectory</w:t>
-      </w:r>
-      <w:proofErr w:type="spellEnd"/>
-      <w:r>
-        <w:rPr>
-          <w:b/>
-          <w:bCs/>
-          <w:color w:val="000000"/>
-          <w:lang w:eastAsia="zh-CN"/>
-        </w:rPr>
-        <w:t>, an autoregressive Transformer that integrates multitype clinical events through absolute age encoding and continuous relative-time attention. We evaluate the model primarily in UK Biobank and replicate the analyses in MIMIC-IV to probe cross-setting generalization. In this setting, multitype modeling improved several trajectory measures, while relative-time attention raised the locked-test Diagnosis Jaccard from 0.0572 to 0.0711 under the multitype-generation protocol, albeit with representation-dependent effects in MIMIC-IV. Finally, our death-event analyses underscore that trajectory termination and mortality-risk estimation are distinct targets, and the separate fixed-horizon risk evaluation in UK Biobank did not establish the prespecified noninferiority.</w:t>
+        <w:t xml:space="preserve">Index Terms: </w:t>
+      </w:r>
+      <w:r>
+        <w:rPr>
+          <w:color w:val="000000"/>
+          <w:lang w:eastAsia="zh-CN"/>
+        </w:rPr>
+        <w:t>Electronic health records, longitudinal modeling, generative models, clinical trajectory prediction.</w:t>
       </w:r>
     </w:p>
     <w:p>
       <w:pPr>
-        <w:rPr>
-          <w:color w:val="000000"/>
-          <w:lang w:eastAsia="zh-CN"/>
-        </w:rPr>
-      </w:pPr>
-      <w:r>
-        <w:rPr>
-          <w:rFonts w:hint="eastAsia"/>
-          <w:b/>
-          <w:bCs/>
-          <w:color w:val="000000"/>
-          <w:lang w:eastAsia="zh-CN"/>
-        </w:rPr>
-        <w:t xml:space="preserve">Index Terms: </w:t>
-      </w:r>
-      <w:r>
-        <w:rPr>
-          <w:color w:val="000000"/>
-          <w:lang w:eastAsia="zh-CN"/>
-        </w:rPr>
-        <w:t>Electronic health records, longitudinal modeling, generative models, clinical trajectory prediction.</w:t>
+        <w:pStyle w:val="2"/>
+      </w:pPr>
+      <w:bookmarkStart w:id="0" w:name="i.-introduction"/>
+      <w:r>
+        <w:t>I. INTRODUCTION</w:t>
       </w:r>
     </w:p>
     <w:p>
       <w:pPr>
-        <w:pStyle w:val="2"/>
-      </w:pPr>
-      <w:bookmarkStart w:id="0" w:name="i.-introduction"/>
-      <w:r>
-        <w:t>I. INTRODUCTION</w:t>
+        <w:rPr>
+          <w:color w:val="000000"/>
+          <w:lang w:eastAsia="zh-CN"/>
+        </w:rPr>
+      </w:pPr>
+      <w:r>
+        <w:rPr>
+          <w:color w:val="000000"/>
+          <w:lang w:eastAsia="zh-CN"/>
+        </w:rPr>
+        <w:t xml:space="preserve">Longitudinal electronic health records (EHRs) are dated accounts of patients' clinical courses, they record diagnosed diseases, </w:t>
+      </w:r>
+      <w:r>
+        <w:rPr>
+          <w:rFonts w:hint="eastAsia"/>
+          <w:color w:val="000000"/>
+          <w:lang w:eastAsia="zh-CN"/>
+        </w:rPr>
+        <w:t>delivered</w:t>
+      </w:r>
+      <w:r>
+        <w:rPr>
+          <w:color w:val="000000"/>
+          <w:lang w:eastAsia="zh-CN"/>
+        </w:rPr>
+        <w:t xml:space="preserve"> interventions, and changes in</w:t>
+      </w:r>
+      <w:r>
+        <w:rPr>
+          <w:rFonts w:hint="eastAsia"/>
+          <w:color w:val="000000"/>
+          <w:lang w:eastAsia="zh-CN"/>
+        </w:rPr>
+        <w:t xml:space="preserve"> followed</w:t>
+      </w:r>
+      <w:r>
+        <w:rPr>
+          <w:color w:val="000000"/>
+          <w:lang w:eastAsia="zh-CN"/>
+        </w:rPr>
+        <w:t xml:space="preserve"> health status. These sequences with time allow computational models to learn longitudinal disease patterns and anticipate future clinical events from accumulated patient histories. In recent years, advances in deep learning, particularly Transformer-based architectures, have substantially improved the representation of such records and the prediction of subsequent events [1,2].</w:t>
       </w:r>
     </w:p>
     <w:p>
@@ -243,37 +259,104 @@
           <w:color w:val="000000"/>
           <w:lang w:eastAsia="zh-CN"/>
         </w:rPr>
-        <w:t xml:space="preserve">Longitudinal electronic health records (EHRs) are dated accounts of patients' clinical courses, they record diagnosed diseases, </w:t>
-      </w:r>
-      <w:r>
-        <w:rPr>
-          <w:rFonts w:hint="eastAsia"/>
-          <w:color w:val="000000"/>
-          <w:lang w:eastAsia="zh-CN"/>
-        </w:rPr>
-        <w:t>delivered</w:t>
-      </w:r>
-      <w:r>
-        <w:rPr>
-          <w:color w:val="000000"/>
-          <w:lang w:eastAsia="zh-CN"/>
-        </w:rPr>
-        <w:t xml:space="preserve"> interventions, and changes in</w:t>
-      </w:r>
-      <w:r>
-        <w:rPr>
-          <w:rFonts w:hint="eastAsia"/>
-          <w:color w:val="000000"/>
-          <w:lang w:eastAsia="zh-CN"/>
-        </w:rPr>
-        <w:t xml:space="preserve"> followed</w:t>
-      </w:r>
-      <w:r>
-        <w:rPr>
-          <w:color w:val="000000"/>
-          <w:lang w:eastAsia="zh-CN"/>
-        </w:rPr>
-        <w:t xml:space="preserve"> health status. These sequences with time allow computational models to learn longitudinal disease patterns and anticipate future clinical events from accumulated patient histories. In recent years, advances in deep learning, particularly Transformer-based architectures, have substantially improved the representation of such records and the prediction of subsequent events [1,2].</w:t>
+        <w:t xml:space="preserve">Early Transformer-based EHR models, including BEHRT [1] and Med-BERT [2], primarily encode histories for predefined outcomes. </w:t>
+      </w:r>
+      <w:r>
+        <w:rPr>
+          <w:rFonts w:hint="eastAsia"/>
+          <w:color w:val="000000"/>
+          <w:lang w:eastAsia="zh-CN"/>
+        </w:rPr>
+        <w:t>Consequently, more recent g</w:t>
+      </w:r>
+      <w:r>
+        <w:rPr>
+          <w:color w:val="000000"/>
+          <w:lang w:eastAsia="zh-CN"/>
+        </w:rPr>
+        <w:t xml:space="preserve">enerative approaches </w:t>
+      </w:r>
+      <w:r>
+        <w:rPr>
+          <w:color w:val="000000"/>
+          <w:lang w:eastAsia="zh-CN"/>
+        </w:rPr>
+        <w:t>shift this objective toward the future patient timeline itself. For instance</w:t>
+      </w:r>
+      <w:r>
+        <w:rPr>
+          <w:rFonts w:hint="eastAsia"/>
+          <w:color w:val="000000"/>
+          <w:lang w:eastAsia="zh-CN"/>
+        </w:rPr>
+        <w:t>,</w:t>
+      </w:r>
+      <w:r>
+        <w:rPr>
+          <w:color w:val="000000"/>
+          <w:lang w:eastAsia="zh-CN"/>
+        </w:rPr>
+        <w:t xml:space="preserve"> Foresight [3] generates heterogeneous clinical concepts</w:t>
+      </w:r>
+      <w:r>
+        <w:rPr>
+          <w:rFonts w:hint="eastAsia"/>
+          <w:color w:val="000000"/>
+          <w:lang w:eastAsia="zh-CN"/>
+        </w:rPr>
+        <w:t xml:space="preserve"> from longitudinal records</w:t>
+      </w:r>
+      <w:r>
+        <w:rPr>
+          <w:color w:val="000000"/>
+          <w:lang w:eastAsia="zh-CN"/>
+        </w:rPr>
+        <w:t xml:space="preserve">, ETHOS [4] models patient health </w:t>
+      </w:r>
+      <w:r>
+        <w:rPr>
+          <w:rFonts w:hint="eastAsia"/>
+          <w:color w:val="000000"/>
+          <w:lang w:eastAsia="zh-CN"/>
+        </w:rPr>
+        <w:t>trajectories within generative framework</w:t>
+      </w:r>
+      <w:r>
+        <w:rPr>
+          <w:color w:val="000000"/>
+          <w:lang w:eastAsia="zh-CN"/>
+        </w:rPr>
+        <w:t>, and Delphi-2M [5] generates long</w:t>
+      </w:r>
+      <w:r>
+        <w:rPr>
+          <w:rFonts w:hint="eastAsia"/>
+          <w:color w:val="000000"/>
+          <w:lang w:eastAsia="zh-CN"/>
+        </w:rPr>
+        <w:t xml:space="preserve"> </w:t>
+      </w:r>
+      <w:r>
+        <w:rPr>
+          <w:color w:val="000000"/>
+          <w:lang w:eastAsia="zh-CN"/>
+        </w:rPr>
+        <w:t>term disease trajectories</w:t>
+      </w:r>
+      <w:r>
+        <w:rPr>
+          <w:rFonts w:hint="eastAsia"/>
+          <w:color w:val="000000"/>
+          <w:lang w:eastAsia="zh-CN"/>
+        </w:rPr>
+        <w:t xml:space="preserve"> through autoregressive disease event prediction</w:t>
+      </w:r>
+      <w:r>
+        <w:rPr>
+          <w:color w:val="000000"/>
+          <w:lang w:eastAsia="zh-CN"/>
+        </w:rPr>
+        <w:t>. This shift changes the prediction target from a single outcome to a sequence whose event content, elapsed time and termination all require evaluation.</w:t>
       </w:r>
     </w:p>
     <w:p>
@@ -285,77 +368,18 @@
       </w:pPr>
       <w:r>
         <w:rPr>
-          <w:color w:val="000000"/>
-          <w:lang w:eastAsia="zh-CN"/>
-        </w:rPr>
-        <w:t xml:space="preserve">Early Transformer-based EHR models, including BEHRT [1] and Med-BERT [2], primarily encode histories for predefined outcomes. </w:t>
-      </w:r>
-      <w:r>
-        <w:rPr>
-          <w:rFonts w:hint="eastAsia"/>
-          <w:color w:val="000000"/>
-          <w:lang w:eastAsia="zh-CN"/>
-        </w:rPr>
-        <w:t>Consequently, more recent g</w:t>
-      </w:r>
-      <w:r>
-        <w:rPr>
-          <w:color w:val="000000"/>
-          <w:lang w:eastAsia="zh-CN"/>
-        </w:rPr>
-        <w:t xml:space="preserve">enerative approaches </w:t>
-      </w:r>
-      <w:r>
-        <w:rPr>
-          <w:color w:val="000000"/>
-          <w:lang w:eastAsia="zh-CN"/>
-        </w:rPr>
-        <w:t>shift this objective toward the future patient timeline itself. For instance</w:t>
-      </w:r>
-      <w:r>
-        <w:rPr>
-          <w:rFonts w:hint="eastAsia"/>
-          <w:color w:val="000000"/>
-          <w:lang w:eastAsia="zh-CN"/>
-        </w:rPr>
-        <w:t>,</w:t>
-      </w:r>
-      <w:r>
-        <w:rPr>
-          <w:color w:val="000000"/>
-          <w:lang w:eastAsia="zh-CN"/>
-        </w:rPr>
-        <w:t xml:space="preserve"> Foresight [3] generates heterogeneous clinical concepts</w:t>
-      </w:r>
-      <w:r>
-        <w:rPr>
-          <w:rFonts w:hint="eastAsia"/>
-          <w:color w:val="000000"/>
-          <w:lang w:eastAsia="zh-CN"/>
-        </w:rPr>
-        <w:t xml:space="preserve"> from longitudinal records</w:t>
-      </w:r>
-      <w:r>
-        <w:rPr>
-          <w:color w:val="000000"/>
-          <w:lang w:eastAsia="zh-CN"/>
-        </w:rPr>
-        <w:t xml:space="preserve">, ETHOS [4] models patient health </w:t>
-      </w:r>
-      <w:r>
-        <w:rPr>
-          <w:rFonts w:hint="eastAsia"/>
-          <w:color w:val="000000"/>
-          <w:lang w:eastAsia="zh-CN"/>
-        </w:rPr>
-        <w:t>trajectories within generative framework</w:t>
-      </w:r>
-      <w:r>
-        <w:rPr>
-          <w:color w:val="000000"/>
-          <w:lang w:eastAsia="zh-CN"/>
-        </w:rPr>
-        <w:t>, and Delphi-2M [5] generates long</w:t>
+          <w:rFonts w:hint="eastAsia"/>
+          <w:color w:val="000000"/>
+          <w:lang w:eastAsia="zh-CN"/>
+        </w:rPr>
+        <w:t xml:space="preserve">Despite this shift, however, </w:t>
+      </w:r>
+      <w:r>
+        <w:rPr>
+          <w:color w:val="000000"/>
+          <w:lang w:eastAsia="zh-CN"/>
+        </w:rPr>
+        <w:t>several aspects of longitudinal EHR structure remain insufficiently characterized in generative trajectory modeling.</w:t>
       </w:r>
       <w:r>
         <w:rPr>
@@ -370,22 +394,37 @@
           <w:color w:val="000000"/>
           <w:lang w:eastAsia="zh-CN"/>
         </w:rPr>
-        <w:t>term disease trajectories</w:t>
-      </w:r>
-      <w:r>
-        <w:rPr>
-          <w:rFonts w:hint="eastAsia"/>
-          <w:color w:val="000000"/>
-          <w:lang w:eastAsia="zh-CN"/>
-        </w:rPr>
-        <w:t xml:space="preserve"> through autoregressive disease event prediction</w:t>
-      </w:r>
-      <w:r>
-        <w:rPr>
-          <w:color w:val="000000"/>
-          <w:lang w:eastAsia="zh-CN"/>
-        </w:rPr>
-        <w:t>. This shift changes the prediction target from a single outcome to a sequence whose event content, elapsed time and termination all require evaluation.</w:t>
+        <w:t>Existing approaches differ substantially in the types and granularity of clinical events they include,</w:t>
+      </w:r>
+      <w:r>
+        <w:rPr>
+          <w:rFonts w:hint="eastAsia"/>
+          <w:color w:val="000000"/>
+          <w:lang w:eastAsia="zh-CN"/>
+        </w:rPr>
+        <w:t xml:space="preserve"> </w:t>
+      </w:r>
+      <w:r>
+        <w:rPr>
+          <w:color w:val="000000"/>
+          <w:lang w:eastAsia="zh-CN"/>
+        </w:rPr>
+        <w:t xml:space="preserve">which make it difficult to isolate the contribution </w:t>
+      </w:r>
+      <w:r>
+        <w:rPr>
+          <w:color w:val="000000"/>
+          <w:lang w:eastAsia="zh-CN"/>
+        </w:rPr>
+        <w:lastRenderedPageBreak/>
+        <w:t>of extending diagnosis centered sequences to structured multitype EHRs. In addition, longitudinal trajectories depend not only on absolute age or event order but also on the time actually elapsed between clinical events, yet the contribution of continuous event time to multistep trajectory generation inadequately quantified. Since trajectory generation and conventional risk prediction target different quantities, it remains unclear whether improved generative fidelity carries over to fixed-horizon risk discrimination.</w:t>
+      </w:r>
+      <w:r>
+        <w:rPr>
+          <w:color w:val="000000"/>
+          <w:lang w:eastAsia="zh-CN"/>
+        </w:rPr>
+        <w:t xml:space="preserve"> </w:t>
       </w:r>
     </w:p>
     <w:p>
@@ -401,59 +440,44 @@
           <w:color w:val="000000"/>
           <w:lang w:eastAsia="zh-CN"/>
         </w:rPr>
-        <w:t xml:space="preserve">Despite this shift, however, </w:t>
-      </w:r>
-      <w:r>
-        <w:rPr>
-          <w:color w:val="000000"/>
-          <w:lang w:eastAsia="zh-CN"/>
-        </w:rPr>
-        <w:t>several aspects of longitudinal EHR structure remain insufficiently characterized in generative trajectory modeling.</w:t>
-      </w:r>
-      <w:r>
-        <w:rPr>
-          <w:rFonts w:hint="eastAsia"/>
-          <w:color w:val="000000"/>
-          <w:lang w:eastAsia="zh-CN"/>
-        </w:rPr>
-        <w:t xml:space="preserve"> </w:t>
-      </w:r>
-      <w:r>
-        <w:rPr>
-          <w:color w:val="000000"/>
-          <w:lang w:eastAsia="zh-CN"/>
-        </w:rPr>
-        <w:t>Existing approaches differ substantially in the types and granularity of clinical events they include,</w:t>
-      </w:r>
-      <w:r>
-        <w:rPr>
-          <w:rFonts w:hint="eastAsia"/>
-          <w:color w:val="000000"/>
-          <w:lang w:eastAsia="zh-CN"/>
-        </w:rPr>
-        <w:t xml:space="preserve"> </w:t>
-      </w:r>
-      <w:r>
-        <w:rPr>
-          <w:color w:val="000000"/>
-          <w:lang w:eastAsia="zh-CN"/>
-        </w:rPr>
-        <w:t xml:space="preserve">which make it difficult to isolate the contribution of extending diagnosis centered sequences to structured multitype EHRs. In addition, longitudinal trajectories depend </w:t>
-      </w:r>
-      <w:r>
-        <w:rPr>
-          <w:color w:val="000000"/>
-          <w:lang w:eastAsia="zh-CN"/>
-        </w:rPr>
-        <w:lastRenderedPageBreak/>
-        <w:t>not only on absolute age or event order but also on the time actually elapsed between clinical events, yet the contribution of continuous event time to multistep trajectory generation inadequately quantified. Since trajectory generation and conventional risk prediction target different quantities, it remains unclear whether improved generative fidelity carries over to fixed-horizon risk discrimination.</w:t>
-      </w:r>
-      <w:r>
-        <w:rPr>
-          <w:color w:val="000000"/>
-          <w:lang w:eastAsia="zh-CN"/>
-        </w:rPr>
-        <w:t xml:space="preserve"> </w:t>
+        <w:t>To address these problems, w</w:t>
+      </w:r>
+      <w:r>
+        <w:rPr>
+          <w:color w:val="000000"/>
+          <w:lang w:eastAsia="zh-CN"/>
+        </w:rPr>
+        <w:t xml:space="preserve">e </w:t>
+      </w:r>
+      <w:r>
+        <w:rPr>
+          <w:rFonts w:hint="eastAsia"/>
+          <w:color w:val="000000"/>
+          <w:lang w:eastAsia="zh-CN"/>
+        </w:rPr>
+        <w:t>propose</w:t>
+      </w:r>
+      <w:r>
+        <w:rPr>
+          <w:color w:val="000000"/>
+          <w:lang w:eastAsia="zh-CN"/>
+        </w:rPr>
+        <w:t xml:space="preserve"> MedTrajectory</w:t>
+      </w:r>
+      <w:r>
+        <w:rPr>
+          <w:rFonts w:hint="eastAsia"/>
+          <w:color w:val="000000"/>
+          <w:lang w:eastAsia="zh-CN"/>
+        </w:rPr>
+        <w:t xml:space="preserve">, an autoregressive model for multitype longitudinal EHRs </w:t>
+      </w:r>
+      <w:r>
+        <w:rPr>
+          <w:color w:val="000000"/>
+          <w:lang w:eastAsia="zh-CN"/>
+        </w:rPr>
+        <w:t xml:space="preserve">that integrates heterogeneous clinical events with absolute age and continuous relative time representations. Specifically, this study makes the following contributions: </w:t>
       </w:r>
     </w:p>
     <w:p>
@@ -465,75 +489,17 @@
       </w:pPr>
       <w:r>
         <w:rPr>
-          <w:rFonts w:hint="eastAsia"/>
-          <w:color w:val="000000"/>
-          <w:lang w:eastAsia="zh-CN"/>
-        </w:rPr>
-        <w:t>To address these problems, w</w:t>
-      </w:r>
-      <w:r>
-        <w:rPr>
-          <w:color w:val="000000"/>
-          <w:lang w:eastAsia="zh-CN"/>
-        </w:rPr>
-        <w:t xml:space="preserve">e </w:t>
-      </w:r>
-      <w:r>
-        <w:rPr>
-          <w:rFonts w:hint="eastAsia"/>
-          <w:color w:val="000000"/>
-          <w:lang w:eastAsia="zh-CN"/>
-        </w:rPr>
-        <w:t>propose</w:t>
-      </w:r>
-      <w:r>
-        <w:rPr>
-          <w:color w:val="000000"/>
-          <w:lang w:eastAsia="zh-CN"/>
-        </w:rPr>
-        <w:t xml:space="preserve"> </w:t>
-      </w:r>
-      <w:proofErr w:type="spellStart"/>
-      <w:r>
-        <w:rPr>
-          <w:color w:val="000000"/>
-          <w:lang w:eastAsia="zh-CN"/>
-        </w:rPr>
-        <w:t>MedTrajectory</w:t>
-      </w:r>
-      <w:proofErr w:type="spellEnd"/>
-      <w:r>
-        <w:rPr>
-          <w:rFonts w:hint="eastAsia"/>
-          <w:color w:val="000000"/>
-          <w:lang w:eastAsia="zh-CN"/>
-        </w:rPr>
-        <w:t xml:space="preserve">, an </w:t>
-      </w:r>
-      <w:proofErr w:type="spellStart"/>
-      <w:r>
-        <w:rPr>
-          <w:rFonts w:hint="eastAsia"/>
-          <w:color w:val="000000"/>
-          <w:lang w:eastAsia="zh-CN"/>
-        </w:rPr>
-        <w:t>autoregressive</w:t>
-      </w:r>
-      <w:proofErr w:type="spellEnd"/>
-      <w:r>
-        <w:rPr>
-          <w:rFonts w:hint="eastAsia"/>
-          <w:color w:val="000000"/>
-          <w:lang w:eastAsia="zh-CN"/>
-        </w:rPr>
-        <w:t xml:space="preserve"> model for multitype longitudinal EHRs </w:t>
-      </w:r>
-      <w:r>
-        <w:rPr>
-          <w:color w:val="000000"/>
-          <w:lang w:eastAsia="zh-CN"/>
-        </w:rPr>
-        <w:t xml:space="preserve">that integrates heterogeneous clinical events with absolute age and continuous relative time representations. Specifically, this study makes the following contributions: </w:t>
+          <w:color w:val="000000"/>
+          <w:lang w:eastAsia="zh-CN"/>
+        </w:rPr>
+        <w:t xml:space="preserve">1) </w:t>
+      </w:r>
+      <w:r>
+        <w:rPr>
+          <w:color w:val="000000"/>
+          <w:lang w:eastAsia="zh-CN"/>
+        </w:rPr>
+        <w:t>We develop a unified multitype EHR representation and quantify what procedures, cancer registrations, and mortality related events add to diagnosis centered trajectories.</w:t>
       </w:r>
     </w:p>
     <w:p>
@@ -548,14 +514,67 @@
           <w:color w:val="000000"/>
           <w:lang w:eastAsia="zh-CN"/>
         </w:rPr>
-        <w:t xml:space="preserve">1) </w:t>
-      </w:r>
-      <w:r>
-        <w:rPr>
-          <w:color w:val="000000"/>
-          <w:lang w:eastAsia="zh-CN"/>
-        </w:rPr>
-        <w:t>We develop a unified multitype EHR representation and quantify what procedures, cancer registrations, and mortality related events add to diagnosis centered trajectories.</w:t>
+        <w:t xml:space="preserve">2) </w:t>
+      </w:r>
+      <w:r>
+        <w:rPr>
+          <w:rFonts w:hint="eastAsia"/>
+          <w:color w:val="000000"/>
+          <w:lang w:eastAsia="zh-CN"/>
+        </w:rPr>
+        <w:t>We introduce c</w:t>
+      </w:r>
+      <w:r>
+        <w:rPr>
+          <w:color w:val="000000"/>
+          <w:lang w:eastAsia="zh-CN"/>
+        </w:rPr>
+        <w:t>ontinuous relative</w:t>
+      </w:r>
+      <w:r>
+        <w:rPr>
+          <w:rFonts w:hint="eastAsia"/>
+          <w:color w:val="000000"/>
+          <w:lang w:eastAsia="zh-CN"/>
+        </w:rPr>
+        <w:t xml:space="preserve"> </w:t>
+      </w:r>
+      <w:r>
+        <w:rPr>
+          <w:color w:val="000000"/>
+          <w:lang w:eastAsia="zh-CN"/>
+        </w:rPr>
+        <w:t>time attention alongside absolute</w:t>
+      </w:r>
+      <w:r>
+        <w:rPr>
+          <w:rFonts w:hint="eastAsia"/>
+          <w:color w:val="000000"/>
+          <w:lang w:eastAsia="zh-CN"/>
+        </w:rPr>
+        <w:t xml:space="preserve"> </w:t>
+      </w:r>
+      <w:r>
+        <w:rPr>
+          <w:color w:val="000000"/>
+          <w:lang w:eastAsia="zh-CN"/>
+        </w:rPr>
+        <w:t>age encoding, with a separate monotonic horizon</w:t>
+      </w:r>
+      <w:r>
+        <w:rPr>
+          <w:rFonts w:hint="eastAsia"/>
+          <w:color w:val="000000"/>
+          <w:lang w:eastAsia="zh-CN"/>
+        </w:rPr>
+        <w:t xml:space="preserve"> </w:t>
+      </w:r>
+      <w:r>
+        <w:rPr>
+          <w:color w:val="000000"/>
+          <w:lang w:eastAsia="zh-CN"/>
+        </w:rPr>
+        <w:t>query head for disease prediction. UKB comparisons establish the temporal branch's generation benefit.</w:t>
       </w:r>
     </w:p>
     <w:p>
@@ -570,22 +589,22 @@
           <w:color w:val="000000"/>
           <w:lang w:eastAsia="zh-CN"/>
         </w:rPr>
-        <w:t xml:space="preserve">2) </w:t>
-      </w:r>
-      <w:r>
-        <w:rPr>
-          <w:rFonts w:hint="eastAsia"/>
-          <w:color w:val="000000"/>
-          <w:lang w:eastAsia="zh-CN"/>
-        </w:rPr>
-        <w:t>We introduce c</w:t>
-      </w:r>
-      <w:r>
-        <w:rPr>
-          <w:color w:val="000000"/>
-          <w:lang w:eastAsia="zh-CN"/>
-        </w:rPr>
-        <w:t>ontinuous relative</w:t>
+        <w:t xml:space="preserve">3) </w:t>
+      </w:r>
+      <w:r>
+        <w:rPr>
+          <w:rFonts w:hint="eastAsia"/>
+          <w:color w:val="000000"/>
+          <w:lang w:eastAsia="zh-CN"/>
+        </w:rPr>
+        <w:t>We operate d</w:t>
+      </w:r>
+      <w:r>
+        <w:rPr>
+          <w:color w:val="000000"/>
+          <w:lang w:eastAsia="zh-CN"/>
+        </w:rPr>
+        <w:t>eath</w:t>
       </w:r>
       <w:r>
         <w:rPr>
@@ -600,37 +619,7 @@
           <w:color w:val="000000"/>
           <w:lang w:eastAsia="zh-CN"/>
         </w:rPr>
-        <w:t>time attention alongside absolute</w:t>
-      </w:r>
-      <w:r>
-        <w:rPr>
-          <w:rFonts w:hint="eastAsia"/>
-          <w:color w:val="000000"/>
-          <w:lang w:eastAsia="zh-CN"/>
-        </w:rPr>
-        <w:t xml:space="preserve"> </w:t>
-      </w:r>
-      <w:r>
-        <w:rPr>
-          <w:color w:val="000000"/>
-          <w:lang w:eastAsia="zh-CN"/>
-        </w:rPr>
-        <w:t>age encoding, with a separate monotonic horizon</w:t>
-      </w:r>
-      <w:r>
-        <w:rPr>
-          <w:rFonts w:hint="eastAsia"/>
-          <w:color w:val="000000"/>
-          <w:lang w:eastAsia="zh-CN"/>
-        </w:rPr>
-        <w:t xml:space="preserve"> </w:t>
-      </w:r>
-      <w:r>
-        <w:rPr>
-          <w:color w:val="000000"/>
-          <w:lang w:eastAsia="zh-CN"/>
-        </w:rPr>
-        <w:t>query head for disease prediction. UKB comparisons establish the temporal branch's generation benefit.</w:t>
+        <w:t>token ablation and independent mortality estimation that quantify termination effects and distinguish generated terminal events from calibrated risk.</w:t>
       </w:r>
     </w:p>
     <w:p>
@@ -645,22 +634,22 @@
           <w:color w:val="000000"/>
           <w:lang w:eastAsia="zh-CN"/>
         </w:rPr>
-        <w:t xml:space="preserve">3) </w:t>
-      </w:r>
-      <w:r>
-        <w:rPr>
-          <w:rFonts w:hint="eastAsia"/>
-          <w:color w:val="000000"/>
-          <w:lang w:eastAsia="zh-CN"/>
-        </w:rPr>
-        <w:t>We operate d</w:t>
-      </w:r>
-      <w:r>
-        <w:rPr>
-          <w:color w:val="000000"/>
-          <w:lang w:eastAsia="zh-CN"/>
-        </w:rPr>
-        <w:t>eath</w:t>
+        <w:t xml:space="preserve">4) </w:t>
+      </w:r>
+      <w:r>
+        <w:rPr>
+          <w:rFonts w:hint="eastAsia"/>
+          <w:color w:val="000000"/>
+          <w:lang w:eastAsia="zh-CN"/>
+        </w:rPr>
+        <w:t xml:space="preserve">We add </w:t>
+      </w:r>
+      <w:r>
+        <w:rPr>
+          <w:color w:val="000000"/>
+          <w:lang w:eastAsia="zh-CN"/>
+        </w:rPr>
+        <w:t>MIMIC-IV adaptation and same</w:t>
       </w:r>
       <w:r>
         <w:rPr>
@@ -675,118 +664,156 @@
           <w:color w:val="000000"/>
           <w:lang w:eastAsia="zh-CN"/>
         </w:rPr>
-        <w:t>token ablation and independent mortality estimation that quantify termination effects and distinguish generated terminal events from calibrated risk.</w:t>
+        <w:t>target</w:t>
+      </w:r>
+      <w:r>
+        <w:rPr>
+          <w:rFonts w:hint="eastAsia"/>
+          <w:color w:val="000000"/>
+          <w:lang w:eastAsia="zh-CN"/>
+        </w:rPr>
+        <w:t xml:space="preserve"> </w:t>
+      </w:r>
+      <w:r>
+        <w:rPr>
+          <w:color w:val="000000"/>
+          <w:lang w:eastAsia="zh-CN"/>
+        </w:rPr>
+        <w:t>budget transfer analyses that test reuse of the framework and characterize diagnostic</w:t>
+      </w:r>
+      <w:r>
+        <w:rPr>
+          <w:rFonts w:hint="eastAsia"/>
+          <w:color w:val="000000"/>
+          <w:lang w:eastAsia="zh-CN"/>
+        </w:rPr>
+        <w:t xml:space="preserve"> </w:t>
+      </w:r>
+      <w:r>
+        <w:rPr>
+          <w:color w:val="000000"/>
+          <w:lang w:eastAsia="zh-CN"/>
+        </w:rPr>
+        <w:t>content gains alongside timing and count tradeoffs.</w:t>
       </w:r>
     </w:p>
     <w:p>
       <w:pPr>
-        <w:rPr>
-          <w:color w:val="000000"/>
-          <w:lang w:eastAsia="zh-CN"/>
-        </w:rPr>
-      </w:pPr>
-      <w:r>
-        <w:rPr>
-          <w:color w:val="000000"/>
-          <w:lang w:eastAsia="zh-CN"/>
-        </w:rPr>
-        <w:t xml:space="preserve">4) </w:t>
-      </w:r>
-      <w:r>
-        <w:rPr>
-          <w:rFonts w:hint="eastAsia"/>
-          <w:color w:val="000000"/>
-          <w:lang w:eastAsia="zh-CN"/>
-        </w:rPr>
-        <w:t xml:space="preserve">We add </w:t>
-      </w:r>
-      <w:r>
-        <w:rPr>
-          <w:color w:val="000000"/>
-          <w:lang w:eastAsia="zh-CN"/>
-        </w:rPr>
-        <w:t>MIMIC-IV adaptation and same</w:t>
-      </w:r>
-      <w:r>
-        <w:rPr>
-          <w:rFonts w:hint="eastAsia"/>
-          <w:color w:val="000000"/>
-          <w:lang w:eastAsia="zh-CN"/>
-        </w:rPr>
-        <w:t xml:space="preserve"> </w:t>
-      </w:r>
-      <w:r>
-        <w:rPr>
-          <w:color w:val="000000"/>
-          <w:lang w:eastAsia="zh-CN"/>
-        </w:rPr>
-        <w:t>target</w:t>
-      </w:r>
-      <w:r>
-        <w:rPr>
-          <w:rFonts w:hint="eastAsia"/>
-          <w:color w:val="000000"/>
-          <w:lang w:eastAsia="zh-CN"/>
-        </w:rPr>
-        <w:t xml:space="preserve"> </w:t>
-      </w:r>
-      <w:r>
-        <w:rPr>
-          <w:color w:val="000000"/>
-          <w:lang w:eastAsia="zh-CN"/>
-        </w:rPr>
-        <w:t>budget transfer analyses that test reuse of the framework and characterize diagnostic</w:t>
-      </w:r>
-      <w:r>
-        <w:rPr>
-          <w:rFonts w:hint="eastAsia"/>
-          <w:color w:val="000000"/>
-          <w:lang w:eastAsia="zh-CN"/>
-        </w:rPr>
-        <w:t xml:space="preserve"> </w:t>
-      </w:r>
-      <w:r>
-        <w:rPr>
-          <w:color w:val="000000"/>
-          <w:lang w:eastAsia="zh-CN"/>
-        </w:rPr>
-        <w:t>content gains alongside timing and count tradeoffs.</w:t>
+        <w:pStyle w:val="2"/>
+      </w:pPr>
+      <w:bookmarkStart w:id="1" w:name="ii.-related-work"/>
+      <w:bookmarkEnd w:id="0"/>
+      <w:r>
+        <w:t>II. RELATED WORK</w:t>
       </w:r>
     </w:p>
     <w:p>
       <w:pPr>
-        <w:pStyle w:val="2"/>
-      </w:pPr>
-      <w:bookmarkStart w:id="1" w:name="ii.-related-work"/>
-      <w:bookmarkEnd w:id="0"/>
-      <w:r>
-        <w:t>II. RELATED WORK</w:t>
+        <w:rPr>
+          <w:lang w:eastAsia="zh-CN"/>
+        </w:rPr>
+      </w:pPr>
+      <w:r>
+        <w:rPr>
+          <w:rFonts w:hint="eastAsia"/>
+          <w:lang w:eastAsia="zh-CN"/>
+        </w:rPr>
+        <w:t>The representation of clinical concepts, longitudinal outcome prediction and temporally informed generation of patient trajectories develop rapidly and expand in more areas.</w:t>
       </w:r>
     </w:p>
     <w:p>
       <w:pPr>
-        <w:rPr>
-          <w:lang w:eastAsia="zh-CN"/>
-        </w:rPr>
-      </w:pPr>
-      <w:r>
-        <w:rPr>
-          <w:rFonts w:hint="eastAsia"/>
-          <w:lang w:eastAsia="zh-CN"/>
-        </w:rPr>
-        <w:t>The representation of clinical concepts, longitudinal outcome prediction and temporally informed generation of patient trajectories develop rapidly and expand in more areas.</w:t>
+        <w:pStyle w:val="3"/>
+      </w:pPr>
+      <w:r>
+        <w:rPr>
+          <w:rFonts w:hint="eastAsia"/>
+          <w:lang w:eastAsia="zh-CN"/>
+        </w:rPr>
+        <w:t>A. Disease coding and prediction</w:t>
       </w:r>
     </w:p>
     <w:p>
       <w:pPr>
-        <w:pStyle w:val="3"/>
-      </w:pPr>
-      <w:r>
-        <w:rPr>
-          <w:rFonts w:hint="eastAsia"/>
-          <w:lang w:eastAsia="zh-CN"/>
-        </w:rPr>
-        <w:t>A. Disease coding and prediction</w:t>
+        <w:rPr>
+          <w:color w:val="000000"/>
+          <w:lang w:eastAsia="zh-CN"/>
+        </w:rPr>
+      </w:pPr>
+      <w:r>
+        <w:rPr>
+          <w:color w:val="000000"/>
+          <w:lang w:eastAsia="zh-CN"/>
+        </w:rPr>
+        <w:t xml:space="preserve">Clinical concepts </w:t>
+      </w:r>
+      <w:r>
+        <w:rPr>
+          <w:rFonts w:hint="eastAsia"/>
+          <w:color w:val="000000"/>
+          <w:lang w:eastAsia="zh-CN"/>
+        </w:rPr>
+        <w:t xml:space="preserve">in EHRs </w:t>
+      </w:r>
+      <w:r>
+        <w:rPr>
+          <w:color w:val="000000"/>
+          <w:lang w:eastAsia="zh-CN"/>
+        </w:rPr>
+        <w:t xml:space="preserve">can be represented through standardized codes, ontology structure or biomedical text. Phecodes group ICD codes into clinically meaningful phenotypes [6], while GRAM incorporates hierarchical ontology information </w:t>
+      </w:r>
+      <w:r>
+        <w:rPr>
+          <w:rFonts w:hint="eastAsia"/>
+          <w:color w:val="000000"/>
+          <w:lang w:eastAsia="zh-CN"/>
+        </w:rPr>
+        <w:t>into representation</w:t>
+      </w:r>
+      <w:r>
+        <w:rPr>
+          <w:rFonts w:hint="eastAsia"/>
+          <w:color w:val="000000"/>
+          <w:lang w:eastAsia="zh-CN"/>
+        </w:rPr>
+        <w:t xml:space="preserve"> </w:t>
+      </w:r>
+      <w:r>
+        <w:rPr>
+          <w:color w:val="000000"/>
+          <w:lang w:eastAsia="zh-CN"/>
+        </w:rPr>
+        <w:t xml:space="preserve">[7]. PubMedBERT [8] and SapBERT [9] </w:t>
+      </w:r>
+      <w:r>
+        <w:rPr>
+          <w:rFonts w:hint="eastAsia"/>
+          <w:color w:val="000000"/>
+          <w:lang w:eastAsia="zh-CN"/>
+        </w:rPr>
+        <w:t xml:space="preserve">supply semantic </w:t>
+      </w:r>
+      <w:r>
+        <w:rPr>
+          <w:color w:val="000000"/>
+          <w:lang w:eastAsia="zh-CN"/>
+        </w:rPr>
+        <w:t>representations learned from biomedical language and terminology. These strategies inform code initialization</w:t>
+      </w:r>
+      <w:r>
+        <w:rPr>
+          <w:rFonts w:hint="eastAsia"/>
+          <w:color w:val="000000"/>
+          <w:lang w:eastAsia="zh-CN"/>
+        </w:rPr>
+        <w:t>,</w:t>
+      </w:r>
+      <w:r>
+        <w:rPr>
+          <w:color w:val="000000"/>
+          <w:lang w:eastAsia="zh-CN"/>
+        </w:rPr>
+        <w:t xml:space="preserve"> the contribution of adding an event channel remains a separate question because its inclusion can alter the history, target vocabulary and cohort.</w:t>
       </w:r>
     </w:p>
     <w:p>
@@ -801,46 +828,75 @@
           <w:color w:val="000000"/>
           <w:lang w:eastAsia="zh-CN"/>
         </w:rPr>
-        <w:t xml:space="preserve">Clinical concepts </w:t>
-      </w:r>
-      <w:r>
-        <w:rPr>
-          <w:rFonts w:hint="eastAsia"/>
-          <w:color w:val="000000"/>
-          <w:lang w:eastAsia="zh-CN"/>
-        </w:rPr>
-        <w:t xml:space="preserve">in EHRs </w:t>
-      </w:r>
-      <w:r>
-        <w:rPr>
-          <w:color w:val="000000"/>
-          <w:lang w:eastAsia="zh-CN"/>
-        </w:rPr>
-        <w:t xml:space="preserve">can be represented through standardized codes, ontology structure or biomedical text. </w:t>
-      </w:r>
-      <w:proofErr w:type="spellStart"/>
-      <w:r>
-        <w:rPr>
-          <w:color w:val="000000"/>
-          <w:lang w:eastAsia="zh-CN"/>
-        </w:rPr>
-        <w:t>Phecodes</w:t>
-      </w:r>
-      <w:proofErr w:type="spellEnd"/>
-      <w:r>
-        <w:rPr>
-          <w:color w:val="000000"/>
-          <w:lang w:eastAsia="zh-CN"/>
-        </w:rPr>
-        <w:t xml:space="preserve"> group ICD codes into clinically meaningful phenotypes [6], while GRAM incorporates hierarchical ontology information </w:t>
-      </w:r>
-      <w:r>
-        <w:rPr>
-          <w:rFonts w:hint="eastAsia"/>
-          <w:color w:val="000000"/>
-          <w:lang w:eastAsia="zh-CN"/>
-        </w:rPr>
-        <w:t>into representation</w:t>
+        <w:t>Longitudinal prediction progressed from recurrent and attention</w:t>
+      </w:r>
+      <w:r>
+        <w:rPr>
+          <w:rFonts w:hint="eastAsia"/>
+          <w:color w:val="000000"/>
+          <w:lang w:eastAsia="zh-CN"/>
+        </w:rPr>
+        <w:t>-</w:t>
+      </w:r>
+      <w:r>
+        <w:rPr>
+          <w:color w:val="000000"/>
+          <w:lang w:eastAsia="zh-CN"/>
+        </w:rPr>
+        <w:t>based designs, including Doctor AI [10] and RETAIN [11], to</w:t>
+      </w:r>
+      <w:r>
+        <w:rPr>
+          <w:rFonts w:hint="eastAsia"/>
+          <w:color w:val="000000"/>
+          <w:lang w:eastAsia="zh-CN"/>
+        </w:rPr>
+        <w:t xml:space="preserve"> Transformer-based representations including</w:t>
+      </w:r>
+      <w:r>
+        <w:rPr>
+          <w:color w:val="000000"/>
+          <w:lang w:eastAsia="zh-CN"/>
+        </w:rPr>
+        <w:t xml:space="preserve"> BEHRT [1] and Med-BERT [2]. DeepHit [12], Dynamic-DeepHit [13] and SurvTRACE [14], [15] </w:t>
+      </w:r>
+      <w:r>
+        <w:rPr>
+          <w:rFonts w:hint="eastAsia"/>
+          <w:color w:val="000000"/>
+          <w:lang w:eastAsia="zh-CN"/>
+        </w:rPr>
+        <w:t xml:space="preserve">then extend this line to time bounded outcomes via incorporating </w:t>
+      </w:r>
+      <w:r>
+        <w:rPr>
+          <w:color w:val="000000"/>
+          <w:lang w:eastAsia="zh-CN"/>
+        </w:rPr>
+        <w:t xml:space="preserve">time-to-event outcomes and censoring. </w:t>
+      </w:r>
+      <w:r>
+        <w:rPr>
+          <w:rFonts w:hint="eastAsia"/>
+          <w:color w:val="000000"/>
+          <w:lang w:eastAsia="zh-CN"/>
+        </w:rPr>
+        <w:t xml:space="preserve">However, some of them </w:t>
+      </w:r>
+      <w:r>
+        <w:rPr>
+          <w:color w:val="000000"/>
+          <w:lang w:eastAsia="zh-CN"/>
+        </w:rPr>
+        <w:t>target a predefined outcome or the next recorded visit</w:t>
+      </w:r>
+      <w:r>
+        <w:rPr>
+          <w:rFonts w:hint="eastAsia"/>
+          <w:color w:val="000000"/>
+          <w:lang w:eastAsia="zh-CN"/>
+        </w:rPr>
+        <w:t>, and</w:t>
       </w:r>
       <w:r>
         <w:rPr>
@@ -855,250 +911,64 @@
           <w:color w:val="000000"/>
           <w:lang w:eastAsia="zh-CN"/>
         </w:rPr>
-        <w:t xml:space="preserve">[7]. </w:t>
-      </w:r>
-      <w:proofErr w:type="spellStart"/>
-      <w:r>
-        <w:rPr>
-          <w:color w:val="000000"/>
-          <w:lang w:eastAsia="zh-CN"/>
-        </w:rPr>
-        <w:t>PubMedBERT</w:t>
-      </w:r>
-      <w:proofErr w:type="spellEnd"/>
-      <w:r>
-        <w:rPr>
-          <w:color w:val="000000"/>
-          <w:lang w:eastAsia="zh-CN"/>
-        </w:rPr>
-        <w:t xml:space="preserve"> [8] and </w:t>
-      </w:r>
-      <w:proofErr w:type="spellStart"/>
-      <w:r>
-        <w:rPr>
-          <w:color w:val="000000"/>
-          <w:lang w:eastAsia="zh-CN"/>
-        </w:rPr>
-        <w:t>SapBERT</w:t>
-      </w:r>
-      <w:proofErr w:type="spellEnd"/>
-      <w:r>
-        <w:rPr>
-          <w:color w:val="000000"/>
-          <w:lang w:eastAsia="zh-CN"/>
-        </w:rPr>
-        <w:t xml:space="preserve"> [9] </w:t>
-      </w:r>
-      <w:r>
-        <w:rPr>
-          <w:rFonts w:hint="eastAsia"/>
-          <w:color w:val="000000"/>
-          <w:lang w:eastAsia="zh-CN"/>
-        </w:rPr>
-        <w:t xml:space="preserve">supply semantic </w:t>
-      </w:r>
-      <w:r>
-        <w:rPr>
-          <w:color w:val="000000"/>
-          <w:lang w:eastAsia="zh-CN"/>
-        </w:rPr>
-        <w:t>representations learned from biomedical language and terminology. These strategies inform code initialization</w:t>
-      </w:r>
-      <w:r>
-        <w:rPr>
-          <w:rFonts w:hint="eastAsia"/>
-          <w:color w:val="000000"/>
-          <w:lang w:eastAsia="zh-CN"/>
-        </w:rPr>
-        <w:t>,</w:t>
-      </w:r>
-      <w:r>
-        <w:rPr>
-          <w:color w:val="000000"/>
-          <w:lang w:eastAsia="zh-CN"/>
-        </w:rPr>
-        <w:t xml:space="preserve"> the contribution of adding an event channel remains a separate question because its inclusion can alter the history, target vocabulary and cohort.</w:t>
+        <w:t>a useful generated sequence does not by itself establish accurate disease</w:t>
+      </w:r>
+      <w:r>
+        <w:rPr>
+          <w:rFonts w:hint="eastAsia"/>
+          <w:color w:val="000000"/>
+          <w:lang w:eastAsia="zh-CN"/>
+        </w:rPr>
+        <w:t xml:space="preserve"> </w:t>
+      </w:r>
+      <w:r>
+        <w:rPr>
+          <w:color w:val="000000"/>
+          <w:lang w:eastAsia="zh-CN"/>
+        </w:rPr>
+        <w:t>risk ranking or probability calibration.</w:t>
+      </w:r>
+      <w:r>
+        <w:rPr>
+          <w:rFonts w:hint="eastAsia"/>
+          <w:color w:val="000000"/>
+          <w:lang w:eastAsia="zh-CN"/>
+        </w:rPr>
+        <w:t xml:space="preserve"> </w:t>
       </w:r>
     </w:p>
     <w:p>
       <w:pPr>
-        <w:rPr>
-          <w:color w:val="000000"/>
-          <w:lang w:eastAsia="zh-CN"/>
-        </w:rPr>
-      </w:pPr>
-      <w:r>
-        <w:rPr>
-          <w:color w:val="000000"/>
-          <w:lang w:eastAsia="zh-CN"/>
-        </w:rPr>
-        <w:t>Longitudinal prediction progressed from recurrent and attention</w:t>
-      </w:r>
-      <w:r>
-        <w:rPr>
-          <w:rFonts w:hint="eastAsia"/>
-          <w:color w:val="000000"/>
-          <w:lang w:eastAsia="zh-CN"/>
-        </w:rPr>
-        <w:t>-</w:t>
-      </w:r>
-      <w:r>
-        <w:rPr>
-          <w:color w:val="000000"/>
-          <w:lang w:eastAsia="zh-CN"/>
-        </w:rPr>
-        <w:t>based designs, including Doctor AI [10] and RETAIN [11], to</w:t>
-      </w:r>
-      <w:r>
-        <w:rPr>
-          <w:rFonts w:hint="eastAsia"/>
-          <w:color w:val="000000"/>
-          <w:lang w:eastAsia="zh-CN"/>
-        </w:rPr>
-        <w:t xml:space="preserve"> Transformer-based representations including</w:t>
-      </w:r>
-      <w:r>
-        <w:rPr>
-          <w:color w:val="000000"/>
-          <w:lang w:eastAsia="zh-CN"/>
-        </w:rPr>
-        <w:t xml:space="preserve"> BEHRT [1] and Med-BERT [2]. </w:t>
-      </w:r>
-      <w:proofErr w:type="spellStart"/>
-      <w:r>
-        <w:rPr>
-          <w:color w:val="000000"/>
-          <w:lang w:eastAsia="zh-CN"/>
-        </w:rPr>
-        <w:t>DeepHit</w:t>
-      </w:r>
-      <w:proofErr w:type="spellEnd"/>
-      <w:r>
-        <w:rPr>
-          <w:color w:val="000000"/>
-          <w:lang w:eastAsia="zh-CN"/>
-        </w:rPr>
-        <w:t xml:space="preserve"> [12], Dynamic-</w:t>
-      </w:r>
-      <w:proofErr w:type="spellStart"/>
-      <w:r>
-        <w:rPr>
-          <w:color w:val="000000"/>
-          <w:lang w:eastAsia="zh-CN"/>
-        </w:rPr>
-        <w:t>DeepHit</w:t>
-      </w:r>
-      <w:proofErr w:type="spellEnd"/>
-      <w:r>
-        <w:rPr>
-          <w:color w:val="000000"/>
-          <w:lang w:eastAsia="zh-CN"/>
-        </w:rPr>
-        <w:t xml:space="preserve"> [13] and </w:t>
-      </w:r>
-      <w:proofErr w:type="spellStart"/>
-      <w:r>
-        <w:rPr>
-          <w:color w:val="000000"/>
-          <w:lang w:eastAsia="zh-CN"/>
-        </w:rPr>
-        <w:t>SurvTRACE</w:t>
-      </w:r>
-      <w:proofErr w:type="spellEnd"/>
-      <w:r>
-        <w:rPr>
-          <w:color w:val="000000"/>
-          <w:lang w:eastAsia="zh-CN"/>
-        </w:rPr>
-        <w:t xml:space="preserve"> [14], [15] </w:t>
-      </w:r>
-      <w:r>
-        <w:rPr>
-          <w:rFonts w:hint="eastAsia"/>
-          <w:color w:val="000000"/>
-          <w:lang w:eastAsia="zh-CN"/>
-        </w:rPr>
-        <w:t xml:space="preserve">then extend this line to time bounded outcomes via incorporating </w:t>
-      </w:r>
-      <w:r>
-        <w:rPr>
-          <w:color w:val="000000"/>
-          <w:lang w:eastAsia="zh-CN"/>
-        </w:rPr>
-        <w:t xml:space="preserve">time-to-event outcomes and censoring. </w:t>
-      </w:r>
-      <w:r>
-        <w:rPr>
-          <w:rFonts w:hint="eastAsia"/>
-          <w:color w:val="000000"/>
-          <w:lang w:eastAsia="zh-CN"/>
-        </w:rPr>
-        <w:t xml:space="preserve">However, some of them </w:t>
-      </w:r>
-      <w:r>
-        <w:rPr>
-          <w:color w:val="000000"/>
-          <w:lang w:eastAsia="zh-CN"/>
-        </w:rPr>
-        <w:t>target a predefined outcome or the next recorded visit</w:t>
-      </w:r>
-      <w:r>
-        <w:rPr>
-          <w:rFonts w:hint="eastAsia"/>
-          <w:color w:val="000000"/>
-          <w:lang w:eastAsia="zh-CN"/>
-        </w:rPr>
-        <w:t>, and</w:t>
-      </w:r>
-      <w:r>
-        <w:rPr>
-          <w:rFonts w:hint="eastAsia"/>
-          <w:color w:val="000000"/>
-          <w:lang w:eastAsia="zh-CN"/>
-        </w:rPr>
-        <w:t xml:space="preserve"> </w:t>
-      </w:r>
-      <w:r>
-        <w:rPr>
-          <w:color w:val="000000"/>
-          <w:lang w:eastAsia="zh-CN"/>
-        </w:rPr>
-        <w:t>a useful generated sequence does not by itself establish accurate disease</w:t>
-      </w:r>
-      <w:r>
-        <w:rPr>
-          <w:rFonts w:hint="eastAsia"/>
-          <w:color w:val="000000"/>
-          <w:lang w:eastAsia="zh-CN"/>
-        </w:rPr>
-        <w:t xml:space="preserve"> </w:t>
-      </w:r>
-      <w:r>
-        <w:rPr>
-          <w:color w:val="000000"/>
-          <w:lang w:eastAsia="zh-CN"/>
-        </w:rPr>
-        <w:t>risk ranking or probability calibration.</w:t>
-      </w:r>
-      <w:r>
-        <w:rPr>
-          <w:rFonts w:hint="eastAsia"/>
-          <w:color w:val="000000"/>
-          <w:lang w:eastAsia="zh-CN"/>
-        </w:rPr>
-        <w:t xml:space="preserve"> </w:t>
+        <w:pStyle w:val="3"/>
+      </w:pPr>
+      <w:r>
+        <w:rPr>
+          <w:rFonts w:hint="eastAsia"/>
+          <w:lang w:eastAsia="zh-CN"/>
+        </w:rPr>
+        <w:t>B. Generative patient trajectory and temporal modeling</w:t>
       </w:r>
     </w:p>
     <w:p>
       <w:pPr>
-        <w:pStyle w:val="3"/>
-      </w:pPr>
-      <w:r>
-        <w:rPr>
-          <w:rFonts w:hint="eastAsia"/>
-          <w:lang w:eastAsia="zh-CN"/>
-        </w:rPr>
-        <w:t>B. Generative patient trajectory and temporal modeling</w:t>
+        <w:rPr>
+          <w:color w:val="000000"/>
+          <w:lang w:eastAsia="zh-CN"/>
+        </w:rPr>
+      </w:pPr>
+      <w:r>
+        <w:rPr>
+          <w:color w:val="000000"/>
+          <w:lang w:eastAsia="zh-CN"/>
+        </w:rPr>
+        <w:t xml:space="preserve">Generative EHR modeling takes the work a step further, shifting the target from predefined outcomes to the patient's future trajectory as a whole. Foresight generates subsequent heterogeneous clinical concepts from longitudinal records [3], whereas ETHOS represents temporally ordered Patient Health </w:t>
+      </w:r>
+      <w:r>
+        <w:rPr>
+          <w:color w:val="000000"/>
+          <w:lang w:eastAsia="zh-CN"/>
+        </w:rPr>
+        <w:t>Timelines without task-specific retraining [4]. Delphi-2M follows a related route, combining autoregressive disease event modeling with continuous age and patient context to produce long term disease trajectories [5]. Collectively, these studies establish that generative patient modeling is feasible, yet they differ considerably in event space, temporal representation and evaluation protocol. Such heterogeneity makes it difficult to attribute observed performance differences to any single design choice.</w:t>
       </w:r>
     </w:p>
     <w:p>
@@ -1113,45 +983,7 @@
           <w:color w:val="000000"/>
           <w:lang w:eastAsia="zh-CN"/>
         </w:rPr>
-        <w:t xml:space="preserve">Generative EHR modeling takes the work a step further, shifting the target from predefined outcomes to the patient's future trajectory as a whole. Foresight generates subsequent heterogeneous clinical concepts from longitudinal records [3], whereas ETHOS represents temporally ordered Patient Health Timelines without task-specific retraining [4]. Delphi-2M follows a related route, combining autoregressive disease </w:t>
-      </w:r>
-      <w:r>
-        <w:rPr>
-          <w:color w:val="000000"/>
-          <w:lang w:eastAsia="zh-CN"/>
-        </w:rPr>
-        <w:t>event modeling with continuous age and patient context to produce long term disease trajectories [5]. Collectively, these studies establish that generative patient modeling is feasible, yet they differ considerably in event space, temporal representation and evaluation protocol. Such heterogeneity makes it difficult to attribute observed performance differences to any single design choice.</w:t>
-      </w:r>
-    </w:p>
-    <w:p>
-      <w:pPr>
-        <w:rPr>
-          <w:color w:val="000000"/>
-          <w:lang w:eastAsia="zh-CN"/>
-        </w:rPr>
-      </w:pPr>
-      <w:r>
-        <w:rPr>
-          <w:color w:val="000000"/>
-          <w:lang w:eastAsia="zh-CN"/>
-        </w:rPr>
-        <w:t xml:space="preserve">Among the divergence in these studies, temporal representation deserves particular attention, since clinical events arise at irregular intervals rather than on a fixed schedule. BEHRT incorporates age and event position into its input representation [1]. CEHR-BERT goes further by introducing explicit time-interval and age representations [16], and </w:t>
-      </w:r>
-      <w:proofErr w:type="spellStart"/>
-      <w:r>
-        <w:rPr>
-          <w:color w:val="000000"/>
-          <w:lang w:eastAsia="zh-CN"/>
-        </w:rPr>
-        <w:t>HiTANet</w:t>
-      </w:r>
-      <w:proofErr w:type="spellEnd"/>
-      <w:r>
-        <w:rPr>
-          <w:color w:val="000000"/>
-          <w:lang w:eastAsia="zh-CN"/>
-        </w:rPr>
-        <w:t xml:space="preserve"> adopts time-aware attention for longitudinal risk prediction [17]. Adaptive clinical risk estimates have likewise been derived from generative health trajectory models [18]. </w:t>
+        <w:t xml:space="preserve">Among the divergence in these studies, temporal representation deserves particular attention, since clinical events arise at irregular intervals rather than on a fixed schedule. BEHRT incorporates age and event position into its input representation [1]. CEHR-BERT goes further by introducing explicit time-interval and age representations [16], and HiTANet adopts time-aware attention for longitudinal risk prediction [17]. Adaptive clinical risk estimates have likewise been derived from generative health trajectory models [18]. </w:t>
       </w:r>
       <w:r>
         <w:rPr>
@@ -1523,17 +1355,8 @@
           <w:rFonts w:hint="eastAsia"/>
           <w:lang w:eastAsia="zh-CN"/>
         </w:rPr>
-        <w:t xml:space="preserve">s occurrence age, </w:t>
-      </w:r>
-      <w:proofErr w:type="spellStart"/>
-      <w:r>
-        <w:rPr>
-          <w:rFonts w:hint="eastAsia"/>
-          <w:lang w:eastAsia="zh-CN"/>
-        </w:rPr>
-        <w:t>MedTrajectory</w:t>
-      </w:r>
-      <w:proofErr w:type="spellEnd"/>
+        <w:t>s occurrence age, MedTrajectory</w:t>
+      </w:r>
       <w:r>
         <w:rPr>
           <w:rFonts w:hint="eastAsia"/>
@@ -1871,21 +1694,12 @@
       </w:r>
     </w:p>
     <w:p>
-      <w:proofErr w:type="spellStart"/>
-      <w:r>
-        <w:rPr>
-          <w:rFonts w:hint="eastAsia"/>
-          <w:lang w:eastAsia="zh-CN"/>
-        </w:rPr>
-        <w:t>MedTrajectory</w:t>
-      </w:r>
-      <w:proofErr w:type="spellEnd"/>
-      <w:r>
-        <w:rPr>
-          <w:rFonts w:hint="eastAsia"/>
-          <w:lang w:eastAsia="zh-CN"/>
-        </w:rPr>
-        <w:t xml:space="preserve"> </w:t>
+      <w:r>
+        <w:rPr>
+          <w:rFonts w:hint="eastAsia"/>
+          <w:lang w:eastAsia="zh-CN"/>
+        </w:rPr>
+        <w:t xml:space="preserve">MedTrajectory </w:t>
       </w:r>
       <w:r>
         <w:rPr>
@@ -2002,6 +1816,7 @@
       <w:bookmarkStart w:id="6" w:name="X08a031cc7242940f3a0e200f0ccfc6bf57873af"/>
       <w:bookmarkEnd w:id="5"/>
       <w:r>
+        <w:lastRenderedPageBreak/>
         <w:t>2</w:t>
       </w:r>
       <w:r>
@@ -2053,15 +1868,7 @@
           <w:rFonts w:hint="eastAsia"/>
           <w:lang w:eastAsia="zh-CN"/>
         </w:rPr>
-        <w:t xml:space="preserve">projected from 1,024 to 64 dimensions by PCA. Procedures </w:t>
-      </w:r>
-      <w:r>
-        <w:rPr>
-          <w:rFonts w:hint="eastAsia"/>
-          <w:lang w:eastAsia="zh-CN"/>
-        </w:rPr>
-        <w:lastRenderedPageBreak/>
-        <w:t>and unmatched entries start at zero</w:t>
+        <w:t>projected from 1,024 to 64 dimensions by PCA. Procedures and unmatched entries start at zero</w:t>
       </w:r>
       <w:r>
         <w:rPr>
@@ -2220,30 +2027,40 @@
             <w:r>
               <w:rPr>
                 <w:rFonts w:ascii="Times New Roman" w:hAnsi="Times New Roman" w:cs="Times New Roman"/>
+                <w:b/>
+                <w:bCs/>
               </w:rPr>
               <w:t xml:space="preserve">Figure </w:t>
             </w:r>
             <w:r>
               <w:rPr>
                 <w:rFonts w:ascii="Times New Roman" w:hAnsi="Times New Roman" w:cs="Times New Roman"/>
+                <w:b/>
+                <w:bCs/>
               </w:rPr>
               <w:fldChar w:fldCharType="begin"/>
             </w:r>
             <w:r>
               <w:rPr>
                 <w:rFonts w:ascii="Times New Roman" w:hAnsi="Times New Roman" w:cs="Times New Roman"/>
+                <w:b/>
+                <w:bCs/>
               </w:rPr>
               <w:instrText xml:space="preserve"> SEQ Figure \* ARABIC </w:instrText>
             </w:r>
             <w:r>
               <w:rPr>
                 <w:rFonts w:ascii="Times New Roman" w:hAnsi="Times New Roman" w:cs="Times New Roman"/>
+                <w:b/>
+                <w:bCs/>
               </w:rPr>
               <w:fldChar w:fldCharType="separate"/>
             </w:r>
             <w:r>
               <w:rPr>
                 <w:rFonts w:ascii="Times New Roman" w:hAnsi="Times New Roman" w:cs="Times New Roman"/>
+                <w:b/>
+                <w:bCs/>
                 <w:noProof/>
               </w:rPr>
               <w:t>1</w:t>
@@ -2251,6 +2068,8 @@
             <w:r>
               <w:rPr>
                 <w:rFonts w:ascii="Times New Roman" w:hAnsi="Times New Roman" w:cs="Times New Roman"/>
+                <w:b/>
+                <w:bCs/>
               </w:rPr>
               <w:fldChar w:fldCharType="end"/>
             </w:r>
@@ -2280,15 +2099,7 @@
       <w:bookmarkEnd w:id="4"/>
       <w:bookmarkEnd w:id="6"/>
       <w:r>
-        <w:t xml:space="preserve">C. </w:t>
-      </w:r>
-      <w:proofErr w:type="spellStart"/>
-      <w:r>
-        <w:t>MedTrajectory</w:t>
-      </w:r>
-      <w:proofErr w:type="spellEnd"/>
-      <w:r>
-        <w:t xml:space="preserve"> architecture</w:t>
+        <w:t>C. MedTrajectory architecture</w:t>
       </w:r>
     </w:p>
     <w:p>
@@ -2309,13 +2120,8 @@
           <w:lang w:eastAsia="zh-CN"/>
         </w:rPr>
       </w:pPr>
-      <w:proofErr w:type="spellStart"/>
-      <w:r>
-        <w:t>MedTrajectory</w:t>
-      </w:r>
-      <w:proofErr w:type="spellEnd"/>
-      <w:r>
-        <w:t xml:space="preserve"> is built on a six-layer, decoder-only causal Transformer [20] with eight attention heads and a hidden dimension of 64, amounting to approximately 1.39M trainable parameters. Causal masking confines the representation of each event to preceding clinical events and to the patient context that is temporally available at that position, which is what allows trajectory generation to proceed autoregressively. Each clinical event enters the model as its event embedding combined with a continuous representation of its absolute age, which we describe in the following subsection</w:t>
+      <w:r>
+        <w:t>MedTrajectory is built on a six-layer, decoder-only causal Transformer [20] with eight attention heads and a hidden dimension of 64, amounting to approximately 1.39M trainable parameters. Causal masking confines the representation of each event to preceding clinical events and to the patient context that is temporally available at that position, which is what allows trajectory generation to proceed autoregressively. Each clinical event enters the model as its event embedding combined with a continuous representation of its absolute age, which we describe in the following subsection</w:t>
       </w:r>
       <w:r>
         <w:rPr>
@@ -3222,6 +3028,8 @@
             </w:pPr>
             <w:r>
               <w:rPr>
+                <w:b/>
+                <w:bCs/>
                 <w:sz w:val="18"/>
               </w:rPr>
               <w:t xml:space="preserve">Figure </w:t>
@@ -3229,6 +3037,8 @@
             <w:r>
               <w:rPr>
                 <w:rFonts w:hint="eastAsia"/>
+                <w:b/>
+                <w:bCs/>
                 <w:sz w:val="18"/>
                 <w:lang w:eastAsia="zh-CN"/>
               </w:rPr>
@@ -3236,37 +3046,17 @@
             </w:r>
             <w:r>
               <w:rPr>
+                <w:b/>
+                <w:bCs/>
                 <w:sz w:val="18"/>
               </w:rPr>
-              <w:t xml:space="preserve">. </w:t>
-            </w:r>
-            <w:proofErr w:type="spellStart"/>
+              <w:t>.</w:t>
+            </w:r>
             <w:r>
               <w:rPr>
                 <w:sz w:val="18"/>
               </w:rPr>
-              <w:t>MedTrajectory</w:t>
-            </w:r>
-            <w:proofErr w:type="spellEnd"/>
-            <w:r>
-              <w:rPr>
-                <w:sz w:val="18"/>
-              </w:rPr>
-              <w:t xml:space="preserve"> architecture and training stages. (a) Generative pretraining with joint event/time logits and separate downstream risk </w:t>
-            </w:r>
-            <w:proofErr w:type="spellStart"/>
-            <w:r>
-              <w:rPr>
-                <w:sz w:val="18"/>
-              </w:rPr>
-              <w:t>posttraining</w:t>
-            </w:r>
-            <w:proofErr w:type="spellEnd"/>
-            <w:r>
-              <w:rPr>
-                <w:sz w:val="18"/>
-              </w:rPr>
-              <w:t>, which updates the backbone and horizon-query head. (b) Continuous-age rotation of Q/K only, masked logit replacement for dynamic-clinical-event pairs, and unrotated V.</w:t>
+              <w:t xml:space="preserve"> MedTrajectory architecture and training stages. (a) Generative pretraining with joint event/time logits and separate downstream risk posttraining, which updates the backbone and horizon-query head. (b) Continuous-age rotation of Q/K only, masked logit replacement for dynamic-clinical-event pairs, and unrotated V.</w:t>
             </w:r>
           </w:p>
         </w:tc>
@@ -3303,15 +3093,7 @@
         <w:t>capture</w:t>
       </w:r>
       <w:r>
-        <w:t xml:space="preserve"> the irregular temporal relationships between clinical events, </w:t>
-      </w:r>
-      <w:proofErr w:type="spellStart"/>
-      <w:r>
-        <w:t>MedTrajectory</w:t>
-      </w:r>
-      <w:proofErr w:type="spellEnd"/>
-      <w:r>
-        <w:t xml:space="preserve"> augments the absolute</w:t>
+        <w:t xml:space="preserve"> the irregular temporal relationships between clinical events, MedTrajectory augments the absolute</w:t>
       </w:r>
       <w:r>
         <w:rPr>
@@ -3542,15 +3324,7 @@
         <w:t xml:space="preserve">enters </w:t>
       </w:r>
       <w:r>
-        <w:t xml:space="preserve">self-attention as an </w:t>
-      </w:r>
-      <w:proofErr w:type="gramStart"/>
-      <w:r>
-        <w:t>additive,</w:t>
-      </w:r>
-      <w:proofErr w:type="gramEnd"/>
-      <w:r>
-        <w:t xml:space="preserve"> masked correction applied to the query and key only. Given hidden representations </w:t>
+        <w:t xml:space="preserve">self-attention as an additive, masked correction applied to the query and key only. Given hidden representations </w:t>
       </w:r>
       <m:oMath>
         <m:r>
@@ -4872,6 +4646,7 @@
     </w:p>
     <w:p>
       <w:r>
+        <w:lastRenderedPageBreak/>
         <w:t xml:space="preserve">Here </w:t>
       </w:r>
       <m:oMath>
@@ -4942,11 +4717,7 @@
         <w:t xml:space="preserve"> Also, w</w:t>
       </w:r>
       <w:r>
-        <w:t xml:space="preserve">e retain both encodings, so that modeling </w:t>
-      </w:r>
-      <w:r>
-        <w:lastRenderedPageBreak/>
-        <w:t>event time intervals does not discard the information of the patient’s absolute age.</w:t>
+        <w:t>e retain both encodings, so that modeling event time intervals does not discard the information of the patient’s absolute age.</w:t>
       </w:r>
     </w:p>
     <w:p>
@@ -5244,23 +5015,7 @@
           <w:rFonts w:hint="eastAsia"/>
           <w:lang w:eastAsia="zh-CN"/>
         </w:rPr>
-        <w:t xml:space="preserve">query head asks whether a specified disease will be recorded within 1, 5 or 10 years of a clinical landmark. It uses learned horizon queries to read the history, rather than counting disease tokens in sampled futures. Risk </w:t>
-      </w:r>
-      <w:proofErr w:type="spellStart"/>
-      <w:r>
-        <w:rPr>
-          <w:rFonts w:hint="eastAsia"/>
-          <w:lang w:eastAsia="zh-CN"/>
-        </w:rPr>
-        <w:t>posttraining</w:t>
-      </w:r>
-      <w:proofErr w:type="spellEnd"/>
-      <w:r>
-        <w:rPr>
-          <w:rFonts w:hint="eastAsia"/>
-          <w:lang w:eastAsia="zh-CN"/>
-        </w:rPr>
-        <w:t xml:space="preserve"> updates both the backbone and head; the frozen-backbone mortality head is a different analysis.</w:t>
+        <w:t>query head asks whether a specified disease will be recorded within 1, 5 or 10 years of a clinical landmark. It uses learned horizon queries to read the history, rather than counting disease tokens in sampled futures. Risk posttraining updates both the backbone and head; the frozen-backbone mortality head is a different analysis.</w:t>
       </w:r>
     </w:p>
     <w:p>
@@ -5302,15 +5057,7 @@
           <w:rFonts w:hint="eastAsia"/>
           <w:lang w:eastAsia="zh-CN"/>
         </w:rPr>
-        <w:t xml:space="preserve">The </w:t>
-      </w:r>
-      <w:proofErr w:type="gramStart"/>
-      <w:r>
-        <w:rPr>
-          <w:rFonts w:hint="eastAsia"/>
-          <w:lang w:eastAsia="zh-CN"/>
-        </w:rPr>
-        <w:t>h</w:t>
+        <w:t>The h</w:t>
       </w:r>
       <w:r>
         <w:t>orizon</w:t>
@@ -5330,11 +5077,7 @@
         <w:t xml:space="preserve"> </w:t>
       </w:r>
       <w:r>
-        <w:t>specific</w:t>
-      </w:r>
-      <w:proofErr w:type="gramEnd"/>
-      <w:r>
-        <w:t xml:space="preserve"> risks are parameterized monotonically to reflect nested cumulative incidence across increasing horizons:</w:t>
+        <w:t>specific risks are parameterized monotonically to reflect nested cumulative incidence across increasing horizons:</w:t>
       </w:r>
     </w:p>
     <w:p>
@@ -5715,23 +5458,7 @@
           <w:color w:val="000000"/>
           <w:lang w:eastAsia="zh-CN"/>
         </w:rPr>
-        <w:t xml:space="preserve">We evaluated </w:t>
-      </w:r>
-      <w:proofErr w:type="spellStart"/>
-      <w:r>
-        <w:rPr>
-          <w:color w:val="000000"/>
-          <w:lang w:eastAsia="zh-CN"/>
-        </w:rPr>
-        <w:t>MedTrajectory</w:t>
-      </w:r>
-      <w:proofErr w:type="spellEnd"/>
-      <w:r>
-        <w:rPr>
-          <w:color w:val="000000"/>
-          <w:lang w:eastAsia="zh-CN"/>
-        </w:rPr>
-        <w:t xml:space="preserve"> using longitudinal UK Biobank records</w:t>
+        <w:t>We evaluated MedTrajectory using longitudinal UK Biobank records</w:t>
       </w:r>
       <w:r>
         <w:rPr>
@@ -5813,22 +5540,7 @@
           <w:color w:val="000000"/>
           <w:lang w:eastAsia="zh-CN"/>
         </w:rPr>
-        <w:t xml:space="preserve">The two task populations overlap and are therefore not additive</w:t>
-      </w:r>
-      <w:r>
-        <w:rPr>
-          <w:color w:val="000000"/>
-          <w:lang w:eastAsia="zh-CN"/>
-        </w:rPr>
-        <w:t/>
-      </w:r>
-      <w:r>
-        <w:rPr>
-          <w:rFonts w:hint="eastAsia"/>
-          <w:color w:val="000000"/>
-          <w:lang w:eastAsia="zh-CN"/>
-        </w:rPr>
-        <w:t xml:space="preserve"/>
+        <w:t>The two task populations overlap and are therefore not additive</w:t>
       </w:r>
       <w:r>
         <w:rPr>
@@ -5936,23 +5648,7 @@
           <w:rFonts w:hint="eastAsia"/>
           <w:lang w:eastAsia="zh-CN"/>
         </w:rPr>
-        <w:t xml:space="preserve">e develop </w:t>
-      </w:r>
-      <w:proofErr w:type="spellStart"/>
-      <w:r>
-        <w:rPr>
-          <w:rFonts w:hint="eastAsia"/>
-          <w:lang w:eastAsia="zh-CN"/>
-        </w:rPr>
-        <w:t>MedTrajectory</w:t>
-      </w:r>
-      <w:proofErr w:type="spellEnd"/>
-      <w:r>
-        <w:rPr>
-          <w:rFonts w:hint="eastAsia"/>
-          <w:lang w:eastAsia="zh-CN"/>
-        </w:rPr>
-        <w:t xml:space="preserve"> into two versions, absolute version and relative version. The </w:t>
+        <w:t xml:space="preserve">e develop MedTrajectory into two versions, absolute version and relative version. The </w:t>
       </w:r>
       <w:r>
         <w:rPr>
@@ -6017,159 +5713,19 @@
           <w:rFonts w:hint="eastAsia"/>
           <w:lang w:eastAsia="zh-CN"/>
         </w:rPr>
-        <w:t xml:space="preserve"> MIMIC additionally includes </w:t>
-      </w:r>
-      <w:proofErr w:type="spellStart"/>
-      <w:r>
-        <w:rPr>
-          <w:rFonts w:hint="eastAsia"/>
-          <w:lang w:eastAsia="zh-CN"/>
-        </w:rPr>
-        <w:t>DoctorGRU</w:t>
-      </w:r>
-      <w:proofErr w:type="spellEnd"/>
-      <w:r>
-        <w:rPr>
-          <w:rFonts w:hint="eastAsia"/>
-          <w:lang w:eastAsia="zh-CN"/>
-        </w:rPr>
-        <w:t xml:space="preserve"> and an index phase A2 control, which is shown in Supplementary S1-S3.</w:t>
+        <w:t xml:space="preserve"> MIMIC </w:t>
+      </w:r>
+      <w:r>
+        <w:rPr>
+          <w:rFonts w:hint="eastAsia"/>
+          <w:lang w:eastAsia="zh-CN"/>
+        </w:rPr>
+        <w:t>additionally includes DoctorGRU and an index phase A2 control, which is shown in Supplementary S1-S3.</w:t>
       </w:r>
     </w:p>
     <w:p>
       <w:r>
         <w:t>We additionally evaluate a diagnosis-only setting in which the target is restricted to diagnosis events: one next-diagnosis target per patient (N = 1,534) with history truncated at the event immediately preceding that diagnosis, and an untimed generation setting that scores generated futures against future diagnoses only (Tables II and III). Common mapped diagnosis targets were scored using each method's registered diagnostic candidate vocabulary, with 1,123 candidates for most methods and 1,255 native diagnosis entries for Delphi. Seven published models or backbones are compared under this setting. These diagnosis-only readouts and the multitype-generation readouts in Supplementary Tables S2 and S9 answer different questions and are not numerically comparable.</w:t>
-      </w:r>
-      <w:r>
-        <w:rPr>
-          <w:rFonts w:hint="eastAsia"/>
-          <w:lang w:eastAsia="zh-CN"/>
-        </w:rPr>
-        <w:t/>
-      </w:r>
-      <w:r>
-        <w:t xml:space="preserve"/>
-      </w:r>
-      <w:r>
-        <w:rPr>
-          <w:rFonts w:hint="eastAsia"/>
-          <w:lang w:eastAsia="zh-CN"/>
-        </w:rPr>
-        <w:t xml:space="preserve"/>
-      </w:r>
-      <w:r>
-        <w:t xml:space="preserve"/>
-      </w:r>
-      <w:r>
-        <w:rPr>
-          <w:rFonts w:hint="eastAsia"/>
-          <w:lang w:eastAsia="zh-CN"/>
-        </w:rPr>
-        <w:t xml:space="preserve"/>
-      </w:r>
-      <w:r>
-        <w:rPr>
-          <w:rFonts w:hint="eastAsia"/>
-          <w:lang w:eastAsia="zh-CN"/>
-        </w:rPr>
-        <w:t xml:space="preserve"/>
-      </w:r>
-      <w:proofErr w:type="spellStart"/>
-      <w:r>
-        <w:rPr>
-          <w:rFonts w:hint="eastAsia"/>
-          <w:lang w:eastAsia="zh-CN"/>
-        </w:rPr>
-        <w:t/>
-      </w:r>
-      <w:proofErr w:type="spellEnd"/>
-      <w:r>
-        <w:rPr>
-          <w:rFonts w:hint="eastAsia"/>
-          <w:lang w:eastAsia="zh-CN"/>
-        </w:rPr>
-        <w:t xml:space="preserve"/>
-      </w:r>
-      <w:r>
-        <w:rPr>
-          <w:rFonts w:hint="eastAsia"/>
-          <w:lang w:eastAsia="zh-CN"/>
-        </w:rPr>
-        <w:t/>
-      </w:r>
-      <w:r>
-        <w:rPr>
-          <w:rFonts w:hint="eastAsia"/>
-          <w:lang w:eastAsia="zh-CN"/>
-        </w:rPr>
-        <w:t xml:space="preserve"/>
-      </w:r>
-      <w:r>
-        <w:rPr>
-          <w:rFonts w:hint="eastAsia"/>
-          <w:lang w:eastAsia="zh-CN"/>
-        </w:rPr>
-        <w:t xml:space="preserve"/>
-      </w:r>
-      <w:r>
-        <w:rPr>
-          <w:rFonts w:hint="eastAsia"/>
-          <w:lang w:eastAsia="zh-CN"/>
-        </w:rPr>
-        <w:t xml:space="preserve"/>
-      </w:r>
-      <w:r>
-        <w:rPr>
-          <w:rFonts w:hint="eastAsia"/>
-          <w:lang w:eastAsia="zh-CN"/>
-        </w:rPr>
-        <w:t xml:space="preserve"/>
-      </w:r>
-      <w:r>
-        <w:t xml:space="preserve"/>
-      </w:r>
-      <w:r>
-        <w:rPr>
-          <w:rFonts w:hint="eastAsia"/>
-          <w:lang w:eastAsia="zh-CN"/>
-        </w:rPr>
-        <w:t/>
-      </w:r>
-      <w:r>
-        <w:t/>
-      </w:r>
-      <w:r>
-        <w:rPr>
-          <w:rFonts w:hint="eastAsia"/>
-          <w:lang w:eastAsia="zh-CN"/>
-        </w:rPr>
-        <w:t xml:space="preserve"/>
-      </w:r>
-      <w:r>
-        <w:t/>
-      </w:r>
-      <w:r>
-        <w:rPr>
-          <w:rFonts w:hint="eastAsia"/>
-          <w:lang w:eastAsia="zh-CN"/>
-        </w:rPr>
-        <w:t xml:space="preserve"/>
-      </w:r>
-      <w:proofErr w:type="spellStart"/>
-      <w:r>
-        <w:rPr>
-          <w:rFonts w:hint="eastAsia"/>
-          <w:lang w:eastAsia="zh-CN"/>
-        </w:rPr>
-        <w:t/>
-      </w:r>
-      <w:proofErr w:type="spellEnd"/>
-      <w:r>
-        <w:rPr>
-          <w:rFonts w:hint="eastAsia"/>
-          <w:lang w:eastAsia="zh-CN"/>
-        </w:rPr>
-        <w:t xml:space="preserve"/>
       </w:r>
     </w:p>
     <w:bookmarkEnd w:id="14"/>
@@ -6224,21 +5780,12 @@
         </w:rPr>
         <w:t xml:space="preserve">20 </w:t>
       </w:r>
-      <w:proofErr w:type="spellStart"/>
-      <w:r>
-        <w:rPr>
-          <w:rFonts w:hint="eastAsia"/>
-          <w:lang w:eastAsia="zh-CN"/>
-        </w:rPr>
-        <w:t>autoregressive</w:t>
-      </w:r>
-      <w:proofErr w:type="spellEnd"/>
-      <w:r>
-        <w:rPr>
-          <w:rFonts w:hint="eastAsia"/>
-          <w:lang w:eastAsia="zh-CN"/>
-        </w:rPr>
-        <w:t xml:space="preserve"> </w:t>
+      <w:r>
+        <w:rPr>
+          <w:rFonts w:hint="eastAsia"/>
+          <w:lang w:eastAsia="zh-CN"/>
+        </w:rPr>
+        <w:t xml:space="preserve">autoregressive </w:t>
       </w:r>
       <w:r>
         <w:rPr>
@@ -6255,10 +5802,7 @@
         <w:t>allowing</w:t>
       </w:r>
       <w:r>
-        <w:t xml:space="preserve"> up to 30 new events over a 10-year </w:t>
-      </w:r>
-      <w:r>
-        <w:t>window</w:t>
+        <w:t xml:space="preserve"> up to 30 new events over a 10-year window</w:t>
       </w:r>
       <w:r>
         <w:rPr>
@@ -6689,7 +6233,11 @@
         <w:t xml:space="preserve">each </w:t>
       </w:r>
       <w:r>
-        <w:t>use 10,000 resamples and 95% confidence intervals.</w:t>
+        <w:t xml:space="preserve">use 10,000 resamples and 95% confidence </w:t>
+      </w:r>
+      <w:r>
+        <w:lastRenderedPageBreak/>
+        <w:t>intervals.</w:t>
       </w:r>
       <w:r>
         <w:rPr>
@@ -6703,30 +6251,14 @@
           <w:rFonts w:hint="eastAsia"/>
           <w:lang w:eastAsia="zh-CN"/>
         </w:rPr>
-        <w:t xml:space="preserve">, shown </w:t>
-      </w:r>
-      <w:proofErr w:type="gramStart"/>
-      <w:r>
-        <w:rPr>
-          <w:rFonts w:hint="eastAsia"/>
-          <w:lang w:eastAsia="zh-CN"/>
-        </w:rPr>
-        <w:t xml:space="preserve">in </w:t>
-      </w:r>
-      <w:r>
-        <w:rPr>
-          <w:rFonts w:hint="eastAsia"/>
-          <w:lang w:eastAsia="zh-CN"/>
-        </w:rPr>
-        <w:t xml:space="preserve"> Supplementary</w:t>
-      </w:r>
-      <w:proofErr w:type="gramEnd"/>
-      <w:r>
-        <w:rPr>
-          <w:rFonts w:hint="eastAsia"/>
-          <w:lang w:eastAsia="zh-CN"/>
-        </w:rPr>
-        <w:t xml:space="preserve"> S6.</w:t>
+        <w:t xml:space="preserve">, shown in </w:t>
+      </w:r>
+      <w:r>
+        <w:rPr>
+          <w:rFonts w:hint="eastAsia"/>
+          <w:lang w:eastAsia="zh-CN"/>
+        </w:rPr>
+        <w:t xml:space="preserve"> Supplementary S6.</w:t>
       </w:r>
     </w:p>
     <w:p>
@@ -6760,7 +6292,22 @@
           <w:color w:val="000000"/>
           <w:lang w:eastAsia="zh-CN"/>
         </w:rPr>
-        <w:t>Expanding diagnosis-only histories with procedures increased Full Top10 from 0.2935 to 0.4832 and selected-disease mean AUROC from 0.7274 to 0.7949; adding cancer/mortality records yielded 0.4891 and 0.7972 (Table I). These historical comparisons support the multitype representation, but also change eligibility and targets. The fixed-target MIMIC procedure analysis provides a complementary input-only contrast, with a small content gain and endpoint-specific tradeoffs.</w:t>
+        <w:t>Expanding diagnosis-only histories with procedures increased Full Top10 from 0.2935 to 0.4832 and selected</w:t>
+      </w:r>
+      <w:r>
+        <w:rPr>
+          <w:rFonts w:hint="eastAsia"/>
+          <w:color w:val="000000"/>
+          <w:lang w:eastAsia="zh-CN"/>
+        </w:rPr>
+        <w:t xml:space="preserve"> </w:t>
+      </w:r>
+      <w:r>
+        <w:rPr>
+          <w:color w:val="000000"/>
+          <w:lang w:eastAsia="zh-CN"/>
+        </w:rPr>
+        <w:t>disease mean AUROC from 0.7274 to 0.7949; adding cancer/mortality records yielded 0.4891 and 0.7972 (Table I). These historical comparisons support the multitype representation, but also change eligibility and targets. The fixed-target MIMIC procedure analysis provides a complementary input-only contrast, with a small content gain and endpoint-specific tradeoffs.</w:t>
       </w:r>
     </w:p>
     <w:p>
@@ -6779,7 +6326,6 @@
           <w:sz w:val="18"/>
           <w:lang w:eastAsia="zh-CN"/>
         </w:rPr>
-        <w:lastRenderedPageBreak/>
         <w:t>TABLE I. Progressive event-space expansion</w:t>
       </w:r>
     </w:p>
@@ -7141,7 +6687,6 @@
         </w:rPr>
         <w:t xml:space="preserve">In free generation, </w:t>
       </w:r>
-      <w:proofErr w:type="spellStart"/>
       <w:r>
         <w:rPr>
           <w:rFonts w:hint="eastAsia"/>
@@ -7150,7 +6695,6 @@
         </w:rPr>
         <w:t>MedTrajectory</w:t>
       </w:r>
-      <w:proofErr w:type="spellEnd"/>
       <w:r>
         <w:rPr>
           <w:color w:val="000000"/>
@@ -7209,88 +6753,7 @@
           <w:color w:val="000000"/>
           <w:lang w:eastAsia="zh-CN"/>
         </w:rPr>
-        <w:t xml:space="preserve">Additionally, Relative did not separate from Absolute in diagnosis-only Hit@10 (+0.065 points [-1.434, 1.565]; adjusted p = 1), whereas in the multitype-generation regime Relative improved Hit@10 by 3.21 points (Supplementary Table S2). Complete recall and length results accompany the paired comparisons in Supplementary Tables S13a-S13e and S2.</w:t>
-      </w:r>
-      <w:proofErr w:type="spellStart"/>
-      <w:r>
-        <w:rPr>
-          <w:rFonts w:hint="eastAsia"/>
-          <w:color w:val="000000"/>
-          <w:lang w:eastAsia="zh-CN"/>
-        </w:rPr>
-        <w:t/>
-      </w:r>
-      <w:proofErr w:type="spellEnd"/>
-      <w:r>
-        <w:rPr>
-          <w:rFonts w:hint="eastAsia"/>
-          <w:color w:val="000000"/>
-          <w:lang w:eastAsia="zh-CN"/>
-        </w:rPr>
-        <w:t xml:space="preserve"/>
-      </w:r>
-      <w:proofErr w:type="gramStart"/>
-      <w:r>
-        <w:rPr>
-          <w:rFonts w:hint="eastAsia"/>
-          <w:color w:val="000000"/>
-          <w:lang w:eastAsia="zh-CN"/>
-        </w:rPr>
-        <w:t/>
-      </w:r>
-      <w:proofErr w:type="gramEnd"/>
-      <w:r>
-        <w:rPr>
-          <w:rFonts w:hint="eastAsia"/>
-          <w:color w:val="000000"/>
-          <w:lang w:eastAsia="zh-CN"/>
-        </w:rPr>
-        <w:t xml:space="preserve"/>
-      </w:r>
-      <w:r>
-        <w:rPr>
-          <w:color w:val="000000"/>
-          <w:lang w:eastAsia="zh-CN"/>
-        </w:rPr>
-        <w:t xml:space="preserve"/>
-      </w:r>
-      <w:r>
-        <w:rPr>
-          <w:rFonts w:hint="eastAsia"/>
-          <w:color w:val="000000"/>
-          <w:lang w:eastAsia="zh-CN"/>
-        </w:rPr>
-        <w:t xml:space="preserve"/>
-      </w:r>
-      <w:r>
-        <w:rPr>
-          <w:color w:val="000000"/>
-          <w:lang w:eastAsia="zh-CN"/>
-        </w:rPr>
-        <w:t xml:space="preserve"/>
-      </w:r>
-      <w:r>
-        <w:rPr>
-          <w:rFonts w:hint="eastAsia"/>
-          <w:color w:val="000000"/>
-          <w:lang w:eastAsia="zh-CN"/>
-        </w:rPr>
-        <w:t xml:space="preserve"/>
-      </w:r>
-      <w:r>
-        <w:rPr>
-          <w:color w:val="000000"/>
-          <w:lang w:eastAsia="zh-CN"/>
-        </w:rPr>
-        <w:t/>
-      </w:r>
-      <w:r>
-        <w:rPr>
-          <w:rFonts w:hint="eastAsia"/>
-          <w:color w:val="000000"/>
-          <w:lang w:eastAsia="zh-CN"/>
-        </w:rPr>
-        <w:t/>
+        <w:t>Additionally, Relative did not separate from Absolute in diagnosis-only Hit@10 (+0.065 points [-1.434, 1.565]; adjusted p = 1), whereas in the multitype-generation regime Relative improved Hit@10 by 3.21 points (Supplementary Table S2). Complete recall and length results accompany the paired comparisons in Supplementary Tables S13a-S13e and S2.</w:t>
       </w:r>
     </w:p>
     <w:p>
@@ -7555,7 +7018,6 @@
                 <w:lang w:eastAsia="zh-CN"/>
               </w:rPr>
             </w:pPr>
-            <w:proofErr w:type="gramStart"/>
             <w:r>
               <w:rPr>
                 <w:rFonts w:hint="eastAsia"/>
@@ -7565,7 +7027,6 @@
               </w:rPr>
               <w:t>Ours(</w:t>
             </w:r>
-            <w:proofErr w:type="gramEnd"/>
             <w:r>
               <w:rPr>
                 <w:color w:val="000000"/>
@@ -7700,7 +7161,6 @@
                 <w:lang w:eastAsia="zh-CN"/>
               </w:rPr>
             </w:pPr>
-            <w:proofErr w:type="gramStart"/>
             <w:r>
               <w:rPr>
                 <w:rFonts w:hint="eastAsia"/>
@@ -7710,7 +7170,6 @@
               </w:rPr>
               <w:t>Ours(</w:t>
             </w:r>
-            <w:proofErr w:type="gramEnd"/>
             <w:r>
               <w:rPr>
                 <w:color w:val="000000"/>
@@ -8364,7 +7823,6 @@
               <w:keepNext/>
               <w:spacing w:line="220" w:lineRule="auto"/>
             </w:pPr>
-            <w:proofErr w:type="spellStart"/>
             <w:r>
               <w:rPr>
                 <w:color w:val="000000"/>
@@ -8372,7 +7830,6 @@
               </w:rPr>
               <w:t>TrajGPT</w:t>
             </w:r>
-            <w:proofErr w:type="spellEnd"/>
           </w:p>
         </w:tc>
         <w:tc>
@@ -8879,11 +8336,9 @@
               <w:keepNext/>
               <w:spacing w:line="220" w:lineRule="auto"/>
               <w:rPr>
-                <w:rFonts w:hint="eastAsia"/>
                 <w:lang w:eastAsia="zh-CN"/>
               </w:rPr>
             </w:pPr>
-            <w:proofErr w:type="gramStart"/>
             <w:r>
               <w:rPr>
                 <w:rFonts w:hint="eastAsia"/>
@@ -8893,7 +8348,6 @@
               </w:rPr>
               <w:t>Ours(</w:t>
             </w:r>
-            <w:proofErr w:type="gramEnd"/>
             <w:r>
               <w:rPr>
                 <w:color w:val="000000"/>
@@ -9012,11 +8466,9 @@
               <w:keepNext/>
               <w:spacing w:line="220" w:lineRule="auto"/>
               <w:rPr>
-                <w:rFonts w:hint="eastAsia"/>
                 <w:lang w:eastAsia="zh-CN"/>
               </w:rPr>
             </w:pPr>
-            <w:proofErr w:type="gramStart"/>
             <w:r>
               <w:rPr>
                 <w:rFonts w:hint="eastAsia"/>
@@ -9026,7 +8478,6 @@
               </w:rPr>
               <w:t>Ours(</w:t>
             </w:r>
-            <w:proofErr w:type="gramEnd"/>
             <w:r>
               <w:rPr>
                 <w:color w:val="000000"/>
@@ -9673,7 +9124,6 @@
               <w:keepNext/>
               <w:spacing w:line="220" w:lineRule="auto"/>
             </w:pPr>
-            <w:proofErr w:type="spellStart"/>
             <w:r>
               <w:rPr>
                 <w:color w:val="000000"/>
@@ -9681,7 +9131,6 @@
               </w:rPr>
               <w:t>TrajGPT</w:t>
             </w:r>
-            <w:proofErr w:type="spellEnd"/>
           </w:p>
         </w:tc>
         <w:tc>
@@ -9901,16 +9350,7 @@
           <w:color w:val="000000"/>
           <w:lang w:eastAsia="zh-CN"/>
         </w:rPr>
-        <w:t xml:space="preserve">In the separate </w:t>
-      </w:r>
-      <w:proofErr w:type="gramStart"/>
-      <w:r>
-        <w:rPr>
-          <w:rFonts w:hint="eastAsia"/>
-          <w:color w:val="000000"/>
-          <w:lang w:eastAsia="zh-CN"/>
-        </w:rPr>
-        <w:t>10</w:t>
+        <w:t>In the separate 10</w:t>
       </w:r>
       <w:r>
         <w:rPr>
@@ -9926,16 +9366,7 @@
           <w:color w:val="000000"/>
           <w:lang w:eastAsia="zh-CN"/>
         </w:rPr>
-        <w:t>year</w:t>
-      </w:r>
-      <w:proofErr w:type="gramEnd"/>
-      <w:r>
-        <w:rPr>
-          <w:rFonts w:hint="eastAsia"/>
-          <w:color w:val="000000"/>
-          <w:lang w:eastAsia="zh-CN"/>
-        </w:rPr>
-        <w:t xml:space="preserve"> evaluation, A2 had Jaccard 2.938%, precision 4.757% and count MAE 3.598 (Supplementary Tables S13c and S13d).</w:t>
+        <w:t>year evaluation, A2 had Jaccard 2.938%, precision 4.757% and count MAE 3.598 (Supplementary Tables S13c and S13d).</w:t>
       </w:r>
       <w:r>
         <w:rPr>
@@ -9999,15 +9430,7 @@
           <w:color w:val="000000"/>
           <w:lang w:eastAsia="zh-CN"/>
         </w:rPr>
-        <w:t xml:space="preserve">, 695.38 for Delphi and 520.72 for TCF. </w:t>
-      </w:r>
-      <w:r>
-        <w:rPr>
-          <w:rFonts w:hint="eastAsia"/>
-          <w:color w:val="000000"/>
-          <w:lang w:eastAsia="zh-CN"/>
-        </w:rPr>
-        <w:t>Availability differed (70.74%-91.79%), so these conditional means do not establish timing superiority. ETHOS interval-membership results are reported separately (Supplementary Table S13c).</w:t>
+        <w:t>, 695.38 for Delphi and 520.72 for TCF. Availability differed (70.74%-91.79%), so these conditional means do not establish timing superiority. ETHOS interval-membership results are reported separately (Supplementary Table S13c).</w:t>
       </w:r>
     </w:p>
     <w:p>
@@ -10040,7 +9463,15 @@
           <w:color w:val="000000"/>
           <w:lang w:eastAsia="zh-CN"/>
         </w:rPr>
-        <w:t>The horizon-query evaluation tests a different use of the learned history: disease-specific prediction at 1, 5 and 10 years. Table IV compares the corrected ten-outcome benchmark in 4,668 held-out participants (260,110 scored records; 277 valid AUROC strata). Relative had macro AUROC 0.7501 versus 0.7462 for Absolute and 0.7424 without absolute age; reference AUROCs ranged from 0.7051 to 0.7263. The AUROC advantage did not carry over to AUPRC, where Absolute was slightly higher (0.2646 versus 0.2616), and both Brier and ECE were lowest for MDRMF (0.0281 and 0.0244) rather than for either MedTrajectory variant.</w:t>
+        <w:t xml:space="preserve">The horizon-query evaluation tests a different use of the learned history: disease-specific prediction at 1, 5 and 10 years. Table IV compares the corrected ten-outcome benchmark in 4,668 held-out participants (260,110 scored records; 277 valid AUROC strata). Relative had macro AUROC 0.7501 versus 0.7462 for Absolute and 0.7424 without absolute age; reference AUROCs ranged from 0.7051 to 0.7263. The AUROC advantage did not carry over to AUPRC, where Absolute was slightly higher (0.2646 versus 0.2616), and both Brier and ECE were lowest for MDRMF </w:t>
+      </w:r>
+      <w:r>
+        <w:rPr>
+          <w:color w:val="000000"/>
+          <w:lang w:eastAsia="zh-CN"/>
+        </w:rPr>
+        <w:lastRenderedPageBreak/>
+        <w:t>(0.0281 and 0.0244) rather than for either MedTrajectory variant.</w:t>
       </w:r>
     </w:p>
     <w:p>
@@ -10070,23 +9501,7 @@
           <w:color w:val="000000"/>
           <w:lang w:eastAsia="zh-CN"/>
         </w:rPr>
-        <w:t xml:space="preserve"> its lower bound (-0.005792) fell below the -0.005 noninferiority margin. Non-</w:t>
-      </w:r>
-      <w:proofErr w:type="spellStart"/>
-      <w:r>
-        <w:rPr>
-          <w:color w:val="000000"/>
-          <w:lang w:eastAsia="zh-CN"/>
-        </w:rPr>
-        <w:t>MedTrajectory</w:t>
-      </w:r>
-      <w:proofErr w:type="spellEnd"/>
-      <w:r>
-        <w:rPr>
-          <w:color w:val="000000"/>
-          <w:lang w:eastAsia="zh-CN"/>
-        </w:rPr>
-        <w:t xml:space="preserve"> comparisons are exploratory (Supplementary S2). These are system-level macro results, not evidence of improvement for every disease/window or an isolated benefit of adding the horizon head.</w:t>
+        <w:t xml:space="preserve"> its lower bound (-0.005792) fell below the -0.005 noninferiority margin. Non-MedTrajectory comparisons are exploratory (Supplementary S2). These are system-level macro results, not evidence of improvement for every disease/window or an isolated benefit of adding the horizon head.</w:t>
       </w:r>
     </w:p>
     <w:p>
@@ -10408,27 +9823,6 @@
               </w:rPr>
               <w:t>0.2616</w:t>
             </w:r>
-            <w:r>
-              <w:rPr>
-                <w:rFonts w:hint="eastAsia"/>
-                <w:b/>
-                <w:bCs/>
-                <w:color w:val="000000"/>
-                <w:sz w:val="16"/>
-                <w:lang w:eastAsia="zh-CN"/>
-              </w:rPr>
-              <w:t/>
-            </w:r>
-            <w:r>
-              <w:rPr>
-                <w:b/>
-                <w:bCs/>
-                <w:color w:val="000000"/>
-                <w:sz w:val="16"/>
-                <w:lang w:eastAsia="zh-CN"/>
-              </w:rPr>
-              <w:t/>
-            </w:r>
           </w:p>
         </w:tc>
         <w:tc>
@@ -10445,7 +9839,6 @@
               <w:spacing w:line="200" w:lineRule="auto"/>
               <w:jc w:val="center"/>
               <w:rPr>
-                <w:rFonts w:hint="eastAsia"/>
                 <w:b/>
                 <w:bCs/>
               </w:rPr>
@@ -10459,28 +9852,6 @@
                 <w:lang w:eastAsia="zh-CN"/>
               </w:rPr>
               <w:t>0.0314</w:t>
-            </w:r>
-            <w:r>
-              <w:rPr>
-                <w:rFonts w:hint="eastAsia"/>
-                <w:b/>
-                <w:bCs/>
-                <w:color w:val="000000"/>
-                <w:sz w:val="16"/>
-                <w:lang w:eastAsia="zh-CN"/>
-              </w:rPr>
-              <w:t/>
-            </w:r>
-            <w:r>
-              <w:rPr>
-                <w:rFonts w:hint="eastAsia"/>
-                <w:b/>
-                <w:bCs/>
-                <w:color w:val="000000"/>
-                <w:sz w:val="16"/>
-                <w:lang w:eastAsia="zh-CN"/>
-              </w:rPr>
-              <w:t/>
             </w:r>
           </w:p>
         </w:tc>
@@ -10573,23 +9944,6 @@
               </w:rPr>
               <w:t>0.2646</w:t>
             </w:r>
-            <w:r>
-              <w:rPr>
-                <w:rFonts w:hint="eastAsia"/>
-                <w:color w:val="000000"/>
-                <w:sz w:val="16"/>
-                <w:lang w:eastAsia="zh-CN"/>
-              </w:rPr>
-              <w:t/>
-            </w:r>
-            <w:r>
-              <w:rPr>
-                <w:color w:val="000000"/>
-                <w:sz w:val="16"/>
-                <w:lang w:eastAsia="zh-CN"/>
-              </w:rPr>
-              <w:t/>
-            </w:r>
           </w:p>
         </w:tc>
         <w:tc>
@@ -10602,9 +9956,6 @@
             <w:pPr>
               <w:spacing w:line="200" w:lineRule="auto"/>
               <w:jc w:val="center"/>
-              <w:rPr>
-                <w:rFonts w:hint="eastAsia"/>
-              </w:rPr>
             </w:pPr>
             <w:r>
               <w:rPr>
@@ -10613,15 +9964,6 @@
                 <w:lang w:eastAsia="zh-CN"/>
               </w:rPr>
               <w:t>0.0292</w:t>
-            </w:r>
-            <w:r>
-              <w:rPr>
-                <w:rFonts w:hint="eastAsia"/>
-                <w:color w:val="000000"/>
-                <w:sz w:val="16"/>
-                <w:lang w:eastAsia="zh-CN"/>
-              </w:rPr>
-              <w:t/>
             </w:r>
           </w:p>
         </w:tc>
@@ -10941,9 +10283,6 @@
             <w:pPr>
               <w:spacing w:line="200" w:lineRule="auto"/>
               <w:jc w:val="center"/>
-              <w:rPr>
-                <w:rFonts w:hint="eastAsia"/>
-              </w:rPr>
             </w:pPr>
             <w:r>
               <w:rPr>
@@ -10952,15 +10291,6 @@
                 <w:lang w:eastAsia="zh-CN"/>
               </w:rPr>
               <w:t>0.0281</w:t>
-            </w:r>
-            <w:r>
-              <w:rPr>
-                <w:rFonts w:hint="eastAsia"/>
-                <w:color w:val="000000"/>
-                <w:sz w:val="16"/>
-                <w:lang w:eastAsia="zh-CN"/>
-              </w:rPr>
-              <w:t/>
             </w:r>
           </w:p>
         </w:tc>
@@ -10988,27 +10318,6 @@
                 <w:lang w:eastAsia="zh-CN"/>
               </w:rPr>
               <w:t>0.0244</w:t>
-            </w:r>
-            <w:r>
-              <w:rPr>
-                <w:rFonts w:hint="eastAsia"/>
-                <w:b/>
-                <w:bCs/>
-                <w:color w:val="000000"/>
-                <w:sz w:val="16"/>
-                <w:lang w:eastAsia="zh-CN"/>
-              </w:rPr>
-              <w:t/>
-            </w:r>
-            <w:r>
-              <w:rPr>
-                <w:b/>
-                <w:bCs/>
-                <w:color w:val="000000"/>
-                <w:sz w:val="16"/>
-                <w:lang w:eastAsia="zh-CN"/>
-              </w:rPr>
-              <w:t/>
             </w:r>
           </w:p>
         </w:tc>
@@ -11244,23 +10553,7 @@
           <w:color w:val="000000"/>
           <w:lang w:eastAsia="zh-CN"/>
         </w:rPr>
-        <w:t xml:space="preserve">MT: </w:t>
-      </w:r>
-      <w:proofErr w:type="spellStart"/>
-      <w:r>
-        <w:rPr>
-          <w:color w:val="000000"/>
-          <w:lang w:eastAsia="zh-CN"/>
-        </w:rPr>
-        <w:t>MedTrajectory</w:t>
-      </w:r>
-      <w:proofErr w:type="spellEnd"/>
-      <w:r>
-        <w:rPr>
-          <w:color w:val="000000"/>
-          <w:lang w:eastAsia="zh-CN"/>
-        </w:rPr>
-        <w:t>. A0/A2/no-age are three-seed means; other systems use fixed seed-42 checkpoints. Higher AUROC/AUPRC and lower Brier/ECE are favorable. Med-BERT follows the configuration of the original publication and is not budget-matched to MedTrajectory; a budget-matched variant is retained in the aggregate numerical archive.</w:t>
+        <w:t>MT: MedTrajectory. A0/A2/no-age are three-seed means; other systems use fixed seed-42 checkpoints. Higher AUROC/AUPRC and lower Brier/ECE are favorable. Med-BERT follows the configuration of the original publication and is not budget-matched to MedTrajectory; a budget-matched variant is retained in the aggregate numerical archive.</w:t>
       </w:r>
     </w:p>
     <w:p>
@@ -11283,7 +10576,7 @@
           <w:color w:val="000000"/>
           <w:lang w:eastAsia="zh-CN"/>
         </w:rPr>
-        <w:t>Mortality-related tokens encode clinical information and terminate a generated trajectory. Blocking them reduced validation Jaccard from 0.0697 to 0.0378 for Absolute and from 0.0834 to 0.0530 for Relative, while increasing count MAE in both models (Fig. 3A/B). Relative retained a paired content advantage of +0.0151 [0.0117, 0.0189] after blocking.</w:t>
+        <w:t>Mortality-related tokens encode clinical information and terminate a generated trajectory. Blocking them reduced validation Jaccard from 0.0697 to 0.0378 for Absolute and from 0.0834 to 0.0530 for Relative, while increasing count MAE in both models (Fig. 3A/B). Relative retained a paired content advantage of +0.0151  after blocking.</w:t>
       </w:r>
     </w:p>
     <w:p>
@@ -11298,7 +10591,37 @@
           <w:color w:val="000000"/>
           <w:lang w:eastAsia="zh-CN"/>
         </w:rPr>
-        <w:t>In the locked test, observed mortality was 0.1220, compared with rollout death frequencies 0.6530/0.7290 for Absolute/Relative. Figure 3C separately compares four models on the same outcome-observable validation subset. An independently calibrated head brought mean probabilities closer to observed mortality; this does not make rollout frequencies calibrated risk. Blocking changes the candidate distribution and stopping rule jointly, rather than identifying the training cause of excessive death generation.</w:t>
+        <w:t xml:space="preserve">In the locked test, </w:t>
+      </w:r>
+      <w:r>
+        <w:rPr>
+          <w:rFonts w:hint="eastAsia"/>
+          <w:color w:val="000000"/>
+          <w:lang w:eastAsia="zh-CN"/>
+        </w:rPr>
+        <w:t xml:space="preserve">the </w:t>
+      </w:r>
+      <w:r>
+        <w:rPr>
+          <w:color w:val="000000"/>
+          <w:lang w:eastAsia="zh-CN"/>
+        </w:rPr>
+        <w:t xml:space="preserve">observed mortality was 0.1220, compared with rollout death frequencies 0.6530/0.7290 for </w:t>
+      </w:r>
+      <w:r>
+        <w:rPr>
+          <w:rFonts w:hint="eastAsia"/>
+          <w:color w:val="000000"/>
+          <w:lang w:eastAsia="zh-CN"/>
+        </w:rPr>
+        <w:t>our two models</w:t>
+      </w:r>
+      <w:r>
+        <w:rPr>
+          <w:color w:val="000000"/>
+          <w:lang w:eastAsia="zh-CN"/>
+        </w:rPr>
+        <w:t>. Figure 3C separately compares four models on the same outcome-observable validation subset. An independently calibrated head brought mean probabilities closer to observed mortality; this does not make rollout frequencies calibrated risk. Blocking changes the candidate distribution and stopping rule jointly, rather than identifying the training cause of excessive death generation.</w:t>
       </w:r>
     </w:p>
     <w:tbl>
@@ -11336,7 +10659,9 @@
               <w:spacing w:before="80" w:after="60"/>
             </w:pPr>
             <w:r>
-              <w:lastRenderedPageBreak/>
+              <w:rPr>
+                <w:noProof/>
+              </w:rPr>
               <w:drawing>
                 <wp:inline distT="0" distB="0" distL="0" distR="0" wp14:anchorId="047EAC62" wp14:editId="0426A290">
                   <wp:extent cx="3063240" cy="1881505"/>
@@ -11534,42 +10859,24 @@
                 <w:sz w:val="18"/>
                 <w:lang w:eastAsia="zh-CN"/>
               </w:rPr>
-              <w:t xml:space="preserve"> a 10-year window and a </w:t>
-            </w:r>
-            <w:proofErr w:type="gramStart"/>
-            <w:r>
-              <w:rPr>
+              <w:t xml:space="preserve"> a 10-year window and a 30</w:t>
+            </w:r>
+            <w:r>
+              <w:rPr>
+                <w:rFonts w:hint="eastAsia"/>
                 <w:color w:val="000000"/>
                 <w:sz w:val="18"/>
                 <w:lang w:eastAsia="zh-CN"/>
               </w:rPr>
-              <w:t>30</w:t>
-            </w:r>
-            <w:r>
-              <w:rPr>
-                <w:rFonts w:hint="eastAsia"/>
+              <w:t xml:space="preserve"> </w:t>
+            </w:r>
+            <w:r>
+              <w:rPr>
                 <w:color w:val="000000"/>
                 <w:sz w:val="18"/>
                 <w:lang w:eastAsia="zh-CN"/>
               </w:rPr>
-              <w:t xml:space="preserve"> </w:t>
-            </w:r>
-            <w:r>
-              <w:rPr>
-                <w:color w:val="000000"/>
-                <w:sz w:val="18"/>
-                <w:lang w:eastAsia="zh-CN"/>
-              </w:rPr>
-              <w:t>event</w:t>
-            </w:r>
-            <w:proofErr w:type="gramEnd"/>
-            <w:r>
-              <w:rPr>
-                <w:color w:val="000000"/>
-                <w:sz w:val="18"/>
-                <w:lang w:eastAsia="zh-CN"/>
-              </w:rPr>
-              <w:t xml:space="preserve"> cap. Blocking removes death from both event candidates and the waiting-time rate and prevents death-triggered termination; the experiment therefore evaluates their combined effect.</w:t>
+              <w:t>event cap. Blocking removes death from both event candidates and the waiting-time rate and prevents death-triggered termination; the experiment therefore evaluates their combined effect.</w:t>
             </w:r>
           </w:p>
         </w:tc>
@@ -11756,6 +11063,7 @@
           <w:color w:val="000000"/>
           <w:lang w:eastAsia="zh-CN"/>
         </w:rPr>
+        <w:lastRenderedPageBreak/>
         <w:t>over Absolute by 0.00172 and over index</w:t>
       </w:r>
       <w:r>
@@ -11771,23 +11079,7 @@
           <w:color w:val="000000"/>
           <w:lang w:eastAsia="zh-CN"/>
         </w:rPr>
-        <w:t xml:space="preserve">phase </w:t>
-      </w:r>
-      <w:proofErr w:type="spellStart"/>
-      <w:r>
-        <w:rPr>
-          <w:color w:val="000000"/>
-          <w:lang w:eastAsia="zh-CN"/>
-        </w:rPr>
-        <w:t>RoPE</w:t>
-      </w:r>
-      <w:proofErr w:type="spellEnd"/>
-      <w:r>
-        <w:rPr>
-          <w:color w:val="000000"/>
-          <w:lang w:eastAsia="zh-CN"/>
-        </w:rPr>
-        <w:t xml:space="preserve"> by 0.00249, without established superiority over ETHOS.</w:t>
+        <w:t>phase RoPE by 0.00249, without established superiority over ETHOS.</w:t>
       </w:r>
     </w:p>
     <w:p>
@@ -11861,7 +11153,6 @@
     <w:p>
       <w:pPr>
         <w:rPr>
-          <w:rFonts w:hint="eastAsia"/>
           <w:color w:val="000000"/>
           <w:lang w:eastAsia="zh-CN"/>
         </w:rPr>
@@ -12022,68 +11313,7 @@
                 <w:sz w:val="18"/>
                 <w:lang w:eastAsia="zh-CN"/>
               </w:rPr>
-              <w:t xml:space="preserve">Figure 5. Effect of UKB initialization on free-generation performance in MIMIC-IV. (A) Training from scratch; (B) UKB-pretrained initialization, both with 10,000 target domain updates. Five models are evaluated using diagnosis Jaccard, recall, Count MAE, first-record Time MAE (days), and normalized edit distance. Values are mean +/- SD across three seeds, and green/red shading indicates better/worse rankings within each panel and metric. Bold values mark the best means, not statistical significance.</w:t>
-            </w:r>
-            <w:r>
-              <w:rPr>
-                <w:b/>
-                <w:bCs/>
-                <w:color w:val="000000"/>
-                <w:sz w:val="18"/>
-                <w:lang w:eastAsia="zh-CN"/>
-              </w:rPr>
-              <w:t/>
-            </w:r>
-            <w:r>
-              <w:rPr>
-                <w:color w:val="000000"/>
-                <w:sz w:val="18"/>
-                <w:lang w:eastAsia="zh-CN"/>
-              </w:rPr>
-              <w:t xml:space="preserve"/>
-            </w:r>
-            <w:r>
-              <w:rPr>
-                <w:rFonts w:hint="eastAsia"/>
-                <w:color w:val="000000"/>
-                <w:sz w:val="18"/>
-                <w:lang w:eastAsia="zh-CN"/>
-              </w:rPr>
-              <w:t xml:space="preserve"/>
-            </w:r>
-            <w:r>
-              <w:rPr>
-                <w:color w:val="000000"/>
-                <w:sz w:val="18"/>
-                <w:lang w:eastAsia="zh-CN"/>
-              </w:rPr>
-              <w:t/>
-            </w:r>
-            <w:r>
-              <w:rPr>
-                <w:rFonts w:hint="eastAsia"/>
-                <w:color w:val="000000"/>
-                <w:sz w:val="18"/>
-                <w:lang w:eastAsia="zh-CN"/>
-              </w:rPr>
-              <w:t xml:space="preserve"/>
-            </w:r>
-            <w:r>
-              <w:rPr>
-                <w:rFonts w:hint="eastAsia"/>
-                <w:color w:val="000000"/>
-                <w:sz w:val="18"/>
-                <w:lang w:eastAsia="zh-CN"/>
-              </w:rPr>
-              <w:t/>
-            </w:r>
-            <w:r>
-              <w:rPr>
-                <w:color w:val="000000"/>
-                <w:sz w:val="18"/>
-                <w:lang w:eastAsia="zh-CN"/>
-              </w:rPr>
-              <w:t xml:space="preserve"/>
+              <w:t>Figure 5. Effect of UKB initialization on free-generation performance in MIMIC-IV. (A) Training from scratch; (B) UKB-pretrained initialization, both with 10,000 target domain updates. Five models are evaluated using diagnosis Jaccard, recall, Count MAE, first-record Time MAE (days), and normalized edit distance. Values are mean +/- SD across three seeds, and green/red shading indicates better/worse rankings within each panel and metric. Bold values mark the best means, not statistical significance.</w:t>
             </w:r>
           </w:p>
         </w:tc>
@@ -12109,19 +11339,10 @@
     </w:p>
     <w:p>
       <w:r>
-        <w:t xml:space="preserve">We developed </w:t>
-      </w:r>
-      <w:proofErr w:type="spellStart"/>
-      <w:r>
-        <w:t>MedTrajectory</w:t>
-      </w:r>
-      <w:proofErr w:type="spellEnd"/>
-      <w:r>
-        <w:t xml:space="preserve">, a generative model for multitype longitudinal EHR trajectories that integrates heterogeneous clinical events with continuous temporal representations. Across the experiments reported here, </w:t>
-      </w:r>
-      <w:r>
-        <w:lastRenderedPageBreak/>
-        <w:t>expanding the event space beyond diagnosis-only sequences improved trajectory modeling, with procedures providing the largest incremental contribution. In UK Biobank, continuous relative-time information improved sampled clinical content, timing, and trajectory length, together with teacher-forced next-event ranking.</w:t>
+        <w:t xml:space="preserve">We developed MedTrajectory, a generative model for multitype longitudinal EHR trajectories that integrates heterogeneous clinical events with continuous temporal </w:t>
+      </w:r>
+      <w:r>
+        <w:t>representations. Across the experiments reported here, expanding the event space beyond diagnosis-only sequences improved trajectory modeling, with procedures providing the largest incremental contribution. In UK Biobank, continuous relative-time information improved sampled clinical content, timing, and trajectory length, together with teacher-forced next-event ranking.</w:t>
       </w:r>
     </w:p>
     <w:p>
@@ -12210,27 +11431,13 @@
         <w:rPr>
           <w:lang w:eastAsia="zh-CN"/>
         </w:rPr>
-        <w:t xml:space="preserve">n risk discrimination. The </w:t>
-      </w:r>
-      <w:proofErr w:type="gramStart"/>
-      <w:r>
-        <w:rPr>
-          <w:lang w:eastAsia="zh-CN"/>
-        </w:rPr>
-        <w:t xml:space="preserve">held </w:t>
-      </w:r>
-      <w:r>
-        <w:rPr>
-          <w:lang w:eastAsia="zh-CN"/>
-        </w:rPr>
-        <w:t>out</w:t>
-      </w:r>
-      <w:proofErr w:type="gramEnd"/>
-      <w:r>
-        <w:rPr>
-          <w:lang w:eastAsia="zh-CN"/>
-        </w:rPr>
-        <w:t xml:space="preserve"> risk test</w:t>
+        <w:t xml:space="preserve">n risk discrimination. The held </w:t>
+      </w:r>
+      <w:r>
+        <w:rPr>
+          <w:lang w:eastAsia="zh-CN"/>
+        </w:rPr>
+        <w:t>out risk test</w:t>
       </w:r>
       <w:r>
         <w:rPr>
@@ -12279,27 +11486,13 @@
         <w:rPr>
           <w:lang w:eastAsia="zh-CN"/>
         </w:rPr>
-        <w:t xml:space="preserve"> with the </w:t>
-      </w:r>
-      <w:proofErr w:type="gramStart"/>
-      <w:r>
-        <w:rPr>
-          <w:lang w:eastAsia="zh-CN"/>
-        </w:rPr>
-        <w:t xml:space="preserve">broad </w:t>
-      </w:r>
-      <w:r>
-        <w:rPr>
-          <w:lang w:eastAsia="zh-CN"/>
-        </w:rPr>
-        <w:t>spectrum</w:t>
-      </w:r>
-      <w:proofErr w:type="gramEnd"/>
-      <w:r>
-        <w:rPr>
-          <w:lang w:eastAsia="zh-CN"/>
-        </w:rPr>
-        <w:t xml:space="preserve"> analysis, in which the generative representat</w:t>
+        <w:t xml:space="preserve"> with the broad </w:t>
+      </w:r>
+      <w:r>
+        <w:rPr>
+          <w:lang w:eastAsia="zh-CN"/>
+        </w:rPr>
+        <w:t>spectrum analysis, in which the generative representat</w:t>
       </w:r>
       <w:r>
         <w:rPr>
@@ -12417,23 +11610,11 @@
     </w:p>
     <w:p>
       <w:r>
-        <w:t>Firstly, MIMIC-IV includes dataset-specific training and adaptation from UKB-pretrained parameters, and we report both; this does not establish zero-shot transportability or unchanged-model external validation; broader generalization across healthcare systems and temporal representations requires further evaluation.</w:t>
-      </w:r>
-      <w:r>
-        <w:t xml:space="preserve"/>
-      </w:r>
-      <w:r>
-        <w:t/>
-      </w:r>
-      <w:r>
-        <w:rPr>
-          <w:rFonts w:hint="eastAsia"/>
-          <w:lang w:eastAsia="zh-CN"/>
-        </w:rPr>
-        <w:t xml:space="preserve"/>
-      </w:r>
-      <w:r>
-        <w:t/>
+        <w:t xml:space="preserve">Firstly, MIMIC-IV includes dataset-specific training and adaptation from UKB-pretrained parameters, and we report both; this does not establish zero-shot transportability or unchanged-model external validation; broader generalization </w:t>
+      </w:r>
+      <w:r>
+        <w:lastRenderedPageBreak/>
+        <w:t>across healthcare systems and temporal representations requires further evaluation.</w:t>
       </w:r>
     </w:p>
     <w:p>
@@ -12457,10 +11638,7 @@
         <w:t xml:space="preserve"> </w:t>
       </w:r>
       <w:r>
-        <w:t xml:space="preserve">future split in the locked generation task was defined by token count rather than aligned to a timestamp </w:t>
-      </w:r>
-      <w:r>
-        <w:t>boundary. For 128 of 1,669 participants, the split therefore fell within a group of events sharing the same re</w:t>
+        <w:t>future split in the locked generation task was defined by token count rather than aligned to a timestamp boundary. For 128 of 1,669 participants, the split therefore fell within a group of events sharing the same re</w:t>
       </w:r>
       <w:r>
         <w:t xml:space="preserve">corded age, such that some same </w:t>
@@ -12494,7 +11672,17 @@
         <w:t xml:space="preserve"> </w:t>
       </w:r>
       <w:r>
-        <w:t>count agreement is partly coupled to the prespecified terminal-event rule. Because rollouts terminate when a mortality-related event is generated, earlier terminal-event generation can mechanically shorten sampled trajectories. The mortality</w:t>
+        <w:t>count agreement is partly coupled to the prespecified terminal-event rule. Because rollouts terminate when a mortality</w:t>
+      </w:r>
+      <w:r>
+        <w:rPr>
+          <w:rFonts w:hint="eastAsia"/>
+          <w:lang w:eastAsia="zh-CN"/>
+        </w:rPr>
+        <w:t xml:space="preserve"> </w:t>
+      </w:r>
+      <w:r>
+        <w:t>related event is generated, earlier terminal-event generation can mechanically shorten sampled trajectories. The mortality</w:t>
       </w:r>
       <w:r>
         <w:rPr>
@@ -12561,21 +11749,7 @@
         <w:rPr>
           <w:lang w:eastAsia="zh-CN"/>
         </w:rPr>
-        <w:t xml:space="preserve">Finally, the eligibility correction re-evaluated frozen risk models on eligible participants. An audit found no direct supervised-loss contribution from anchor-only records in the examined </w:t>
-      </w:r>
-      <w:proofErr w:type="spellStart"/>
-      <w:r>
-        <w:rPr>
-          <w:lang w:eastAsia="zh-CN"/>
-        </w:rPr>
-        <w:t>MedTrajectory</w:t>
-      </w:r>
-      <w:proofErr w:type="spellEnd"/>
-      <w:r>
-        <w:rPr>
-          <w:lang w:eastAsia="zh-CN"/>
-        </w:rPr>
-        <w:t xml:space="preserve"> training path. Feature-based baselines were not refitted or reselected on eligible-only data; their comparisons remain exploratory.</w:t>
+        <w:t>Finally, the eligibility correction re-evaluated frozen risk models on eligible participants. An audit found no direct supervised-loss contribution from anchor-only records in the examined MedTrajectory training path. Feature-based baselines were not refitted or reselected on eligible-only data; their comparisons remain exploratory.</w:t>
       </w:r>
     </w:p>
     <w:p>
@@ -12590,15 +11764,7 @@
     </w:p>
     <w:p>
       <w:r>
-        <w:t xml:space="preserve">We present </w:t>
-      </w:r>
-      <w:proofErr w:type="spellStart"/>
-      <w:r>
-        <w:t>MedTrajectory</w:t>
-      </w:r>
-      <w:proofErr w:type="spellEnd"/>
-      <w:r>
-        <w:t>, an autoregressive model for multitype longitudinal EHRs that combines heterogeneou</w:t>
+        <w:t>We present MedTrajectory, an autoregressive model for multitype longitudinal EHRs that combines heterogeneou</w:t>
       </w:r>
       <w:r>
         <w:t xml:space="preserve">s clinical events with absolute age and continuous relative </w:t>
@@ -12614,15 +11780,17 @@
         <w:t>.</w:t>
       </w:r>
       <w:r>
+        <w:t xml:space="preserve"> MedTrajectory integrates multitype clinical events with absolute age and continuous relative-time attention for future-trajectory generation, with a separate horizon-query risk readout. UKB establishes improved generation with the relative</w:t>
+      </w:r>
+      <w:r>
+        <w:rPr>
+          <w:rFonts w:hint="eastAsia"/>
+          <w:lang w:eastAsia="zh-CN"/>
+        </w:rPr>
         <w:t xml:space="preserve"> </w:t>
       </w:r>
-      <w:proofErr w:type="spellStart"/>
-      <w:r>
-        <w:t>MedTrajectory</w:t>
-      </w:r>
-      <w:proofErr w:type="spellEnd"/>
-      <w:r>
-        <w:t xml:space="preserve"> integrates multitype clinical events with absolute age and continuous relative-time attention for future-trajectory generation, with a separate horizon-query risk readout. UKB establishes improved generation with the relative</w:t>
+      <w:r>
+        <w:t>time branch. Death</w:t>
       </w:r>
       <w:r>
         <w:rPr>
@@ -12632,21 +11800,7 @@
         <w:t xml:space="preserve"> </w:t>
       </w:r>
       <w:r>
-        <w:t>time branch. Death</w:t>
-      </w:r>
-      <w:r>
-        <w:rPr>
-          <w:rFonts w:hint="eastAsia"/>
-          <w:lang w:eastAsia="zh-CN"/>
-        </w:rPr>
-        <w:t xml:space="preserve"> </w:t>
-      </w:r>
-      <w:r>
-        <w:t xml:space="preserve">token analysis clarifies the contribution of termination while showing that the content advantage persists after token blocking. MIMIC-IV demonstrates task adaptation and improved generated diagnostic content from UKB initialization, with count and endpoint-specific tradeoffs. These findings support the framework's modeling and transfer </w:t>
-      </w:r>
-      <w:proofErr w:type="gramStart"/>
-      <w:r>
-        <w:t>value</w:t>
+        <w:t>token analysis clarifies the contribution of termination while showing that the content advantage persists after token blocking. MIMIC-IV demonstrates task adaptation and improved generated diagnostic content from UKB initialization, with count and endpoint-specific tradeoffs. These findings support the framework's modeling and transfer value</w:t>
       </w:r>
       <w:r>
         <w:rPr>
@@ -12655,7 +11809,6 @@
         </w:rPr>
         <w:t>,</w:t>
       </w:r>
-      <w:proofErr w:type="gramEnd"/>
       <w:r>
         <w:t xml:space="preserve"> the corrected risk result and retrospective protocols delimit claims about clinical prediction and deployment.</w:t>
       </w:r>
@@ -12697,21 +11850,7 @@
         <w:rPr>
           <w:lang w:eastAsia="zh-CN"/>
         </w:rPr>
-        <w:t xml:space="preserve">The </w:t>
-      </w:r>
-      <w:proofErr w:type="spellStart"/>
-      <w:r>
-        <w:rPr>
-          <w:lang w:eastAsia="zh-CN"/>
-        </w:rPr>
-        <w:t>MedTrajectory</w:t>
-      </w:r>
-      <w:proofErr w:type="spellEnd"/>
-      <w:r>
-        <w:rPr>
-          <w:lang w:eastAsia="zh-CN"/>
-        </w:rPr>
-        <w:t xml:space="preserve"> source code and </w:t>
+        <w:t xml:space="preserve">The MedTrajectory source code and </w:t>
       </w:r>
       <w:r>
         <w:rPr>
@@ -12743,13 +11882,6 @@
         </w:rPr>
         <w:t>ACKNOWLEDGMENT</w:t>
       </w:r>
-      <w:r>
-        <w:rPr>
-          <w:i w:val="0"/>
-          <w:lang w:eastAsia="zh-CN"/>
-        </w:rPr>
-        <w:t xml:space="preserve"/>
-      </w:r>
     </w:p>
     <w:p>
       <w:pPr>
@@ -12761,34 +11893,7 @@
         <w:rPr>
           <w:lang w:eastAsia="zh-CN"/>
         </w:rPr>
-        <w:t xml:space="preserve">The author used a commercially available large language model for English-language editing and readability improvement of this manuscript. The tool was used for language polishing only; it did not generate scientific content, data, analyses, or conclusions. The author reviewed and verified all text and takes full responsibility for the content of this article.</w:t>
-      </w:r>
-      <w:proofErr w:type="spellStart"/>
-      <w:r>
-        <w:rPr>
-          <w:lang w:eastAsia="zh-CN"/>
-        </w:rPr>
-        <w:t/>
-      </w:r>
-      <w:proofErr w:type="spellEnd"/>
-      <w:r>
-        <w:rPr>
-          <w:lang w:eastAsia="zh-CN"/>
-        </w:rPr>
-        <w:t xml:space="preserve"/>
-      </w:r>
-      <w:r>
-        <w:rPr>
-          <w:color w:val="000000" w:themeColor="text1"/>
-          <w:lang w:eastAsia="zh-CN"/>
-        </w:rPr>
-        <w:t xml:space="preserve"/>
-      </w:r>
-      <w:r>
-        <w:rPr>
-          <w:lang w:eastAsia="zh-CN"/>
-        </w:rPr>
-        <w:t/>
+        <w:t>The author used a commercially available large language model for English-language editing and readability improvement of this manuscript. The tool was used for language polishing only; it did not generate scientific content, data, analyses, or conclusions. The author reviewed and verified all text and takes full responsibility for the content of this article.</w:t>
       </w:r>
     </w:p>
     <w:bookmarkEnd w:id="18"/>
@@ -12811,21 +11916,7 @@
         <w:rPr>
           <w:sz w:val="16"/>
         </w:rPr>
-        <w:t xml:space="preserve">[1] Y. Li et al., "BEHRT: Transformer for electronic health records," Sci. Rep., vol. 10, Art. no. 7155, 2020, </w:t>
-      </w:r>
-      <w:proofErr w:type="spellStart"/>
-      <w:r>
-        <w:rPr>
-          <w:sz w:val="16"/>
-        </w:rPr>
-        <w:t>doi</w:t>
-      </w:r>
-      <w:proofErr w:type="spellEnd"/>
-      <w:r>
-        <w:rPr>
-          <w:sz w:val="16"/>
-        </w:rPr>
-        <w:t>: 10.1038/s41598-020-62922-y.</w:t>
+        <w:t>[1] Y. Li et al., "BEHRT: Transformer for electronic health records," Sci. Rep., vol. 10, Art. no. 7155, 2020, doi: 10.1038/s41598-020-62922-y.</w:t>
       </w:r>
     </w:p>
     <w:p>
@@ -12839,35 +11930,7 @@
         <w:rPr>
           <w:sz w:val="16"/>
         </w:rPr>
-        <w:t xml:space="preserve">[2] L. Rasmy, Y. Xiang, Z. Xie, C. Tao, and D. Zhi, "Med-BERT: Pretrained contextualized embeddings on large-scale structured electronic health records for disease prediction," </w:t>
-      </w:r>
-      <w:proofErr w:type="spellStart"/>
-      <w:r>
-        <w:rPr>
-          <w:sz w:val="16"/>
-        </w:rPr>
-        <w:t>npj</w:t>
-      </w:r>
-      <w:proofErr w:type="spellEnd"/>
-      <w:r>
-        <w:rPr>
-          <w:sz w:val="16"/>
-        </w:rPr>
-        <w:t xml:space="preserve"> Digit. Med., vol. 4, Art. no. 86, 2021, </w:t>
-      </w:r>
-      <w:proofErr w:type="spellStart"/>
-      <w:r>
-        <w:rPr>
-          <w:sz w:val="16"/>
-        </w:rPr>
-        <w:t>doi</w:t>
-      </w:r>
-      <w:proofErr w:type="spellEnd"/>
-      <w:r>
-        <w:rPr>
-          <w:sz w:val="16"/>
-        </w:rPr>
-        <w:t>: 10.1038/s41746-021-00455-y.</w:t>
+        <w:t>[2] L. Rasmy, Y. Xiang, Z. Xie, C. Tao, and D. Zhi, "Med-BERT: Pretrained contextualized embeddings on large-scale structured electronic health records for disease prediction," npj Digit. Med., vol. 4, Art. no. 86, 2021, doi: 10.1038/s41746-021-00455-y.</w:t>
       </w:r>
     </w:p>
     <w:p>
@@ -12881,22 +11944,7 @@
         <w:rPr>
           <w:sz w:val="16"/>
         </w:rPr>
-        <w:lastRenderedPageBreak/>
-        <w:t xml:space="preserve">[3] Z. Kraljevic et al., "Foresight—a generative pretrained transformer for modelling of patient timelines using electronic health records: A retrospective modelling study," Lancet Digit. Health, vol. 6, no. 4, pp. e281–e290, Apr. 2024, </w:t>
-      </w:r>
-      <w:proofErr w:type="spellStart"/>
-      <w:r>
-        <w:rPr>
-          <w:sz w:val="16"/>
-        </w:rPr>
-        <w:t>doi</w:t>
-      </w:r>
-      <w:proofErr w:type="spellEnd"/>
-      <w:r>
-        <w:rPr>
-          <w:sz w:val="16"/>
-        </w:rPr>
-        <w:t>: 10.1016/S2589-7500(24)00025-6.</w:t>
+        <w:t>[3] Z. Kraljevic et al., "Foresight—a generative pretrained transformer for modelling of patient timelines using electronic health records: A retrospective modelling study," Lancet Digit. Health, vol. 6, no. 4, pp. e281–e290, Apr. 2024, doi: 10.1016/S2589-7500(24)00025-6.</w:t>
       </w:r>
     </w:p>
     <w:p>
@@ -12910,49 +11958,7 @@
         <w:rPr>
           <w:sz w:val="16"/>
         </w:rPr>
-        <w:t xml:space="preserve">[4] P. </w:t>
-      </w:r>
-      <w:proofErr w:type="spellStart"/>
-      <w:r>
-        <w:rPr>
-          <w:sz w:val="16"/>
-        </w:rPr>
-        <w:t>Renc</w:t>
-      </w:r>
-      <w:proofErr w:type="spellEnd"/>
-      <w:r>
-        <w:rPr>
-          <w:sz w:val="16"/>
-        </w:rPr>
-        <w:t xml:space="preserve"> et al., "Zero shot health trajectory prediction using transformer," </w:t>
-      </w:r>
-      <w:proofErr w:type="spellStart"/>
-      <w:r>
-        <w:rPr>
-          <w:sz w:val="16"/>
-        </w:rPr>
-        <w:t>npj</w:t>
-      </w:r>
-      <w:proofErr w:type="spellEnd"/>
-      <w:r>
-        <w:rPr>
-          <w:sz w:val="16"/>
-        </w:rPr>
-        <w:t xml:space="preserve"> Digit. Med., vol. 7, Art. no. 256, 2024, </w:t>
-      </w:r>
-      <w:proofErr w:type="spellStart"/>
-      <w:r>
-        <w:rPr>
-          <w:sz w:val="16"/>
-        </w:rPr>
-        <w:t>doi</w:t>
-      </w:r>
-      <w:proofErr w:type="spellEnd"/>
-      <w:r>
-        <w:rPr>
-          <w:sz w:val="16"/>
-        </w:rPr>
-        <w:t>: 10.1038/s41746-024-01235-0.</w:t>
+        <w:t>[4] P. Renc et al., "Zero shot health trajectory prediction using transformer," npj Digit. Med., vol. 7, Art. no. 256, 2024, doi: 10.1038/s41746-024-01235-0.</w:t>
       </w:r>
     </w:p>
     <w:p>
@@ -12966,21 +11972,7 @@
         <w:rPr>
           <w:sz w:val="16"/>
         </w:rPr>
-        <w:t xml:space="preserve">[5] A. Shmatko et al., "Learning the natural history of human disease with generative transformers," Nature, vol. 647, no. 8088, pp. 248–256, Nov. 2025, </w:t>
-      </w:r>
-      <w:proofErr w:type="spellStart"/>
-      <w:r>
-        <w:rPr>
-          <w:sz w:val="16"/>
-        </w:rPr>
-        <w:t>doi</w:t>
-      </w:r>
-      <w:proofErr w:type="spellEnd"/>
-      <w:r>
-        <w:rPr>
-          <w:sz w:val="16"/>
-        </w:rPr>
-        <w:t>: 10.1038/s41586-025-09529-3.</w:t>
+        <w:t>[5] A. Shmatko et al., "Learning the natural history of human disease with generative transformers," Nature, vol. 647, no. 8088, pp. 248–256, Nov. 2025, doi: 10.1038/s41586-025-09529-3.</w:t>
       </w:r>
     </w:p>
     <w:p>
@@ -12994,35 +11986,7 @@
         <w:rPr>
           <w:sz w:val="16"/>
         </w:rPr>
-        <w:t xml:space="preserve">[6] P. Wu et al., "Mapping ICD-10 and ICD-10-CM codes to </w:t>
-      </w:r>
-      <w:proofErr w:type="spellStart"/>
-      <w:r>
-        <w:rPr>
-          <w:sz w:val="16"/>
-        </w:rPr>
-        <w:t>phecodes</w:t>
-      </w:r>
-      <w:proofErr w:type="spellEnd"/>
-      <w:r>
-        <w:rPr>
-          <w:sz w:val="16"/>
-        </w:rPr>
-        <w:t xml:space="preserve">: Workflow development and initial evaluation," JMIR Med. Inform., vol. 7, no. 4, Art. no. e14325, 2019, </w:t>
-      </w:r>
-      <w:proofErr w:type="spellStart"/>
-      <w:r>
-        <w:rPr>
-          <w:sz w:val="16"/>
-        </w:rPr>
-        <w:t>doi</w:t>
-      </w:r>
-      <w:proofErr w:type="spellEnd"/>
-      <w:r>
-        <w:rPr>
-          <w:sz w:val="16"/>
-        </w:rPr>
-        <w:t>: 10.2196/14325.</w:t>
+        <w:t>[6] P. Wu et al., "Mapping ICD-10 and ICD-10-CM codes to phecodes: Workflow development and initial evaluation," JMIR Med. Inform., vol. 7, no. 4, Art. no. e14325, 2019, doi: 10.2196/14325.</w:t>
       </w:r>
     </w:p>
     <w:p>
@@ -13036,21 +12000,7 @@
         <w:rPr>
           <w:sz w:val="16"/>
         </w:rPr>
-        <w:t xml:space="preserve">[7] E. Choi, M. T. Bahadori, L. Song, W. F. Stewart, and J. Sun, "GRAM: Graph-based attention model for healthcare representation learning," in Proc. 23rd ACM SIGKDD Int. Conf. Knowledge Discovery and Data Mining, 2017, pp. 787–795, </w:t>
-      </w:r>
-      <w:proofErr w:type="spellStart"/>
-      <w:r>
-        <w:rPr>
-          <w:sz w:val="16"/>
-        </w:rPr>
-        <w:t>doi</w:t>
-      </w:r>
-      <w:proofErr w:type="spellEnd"/>
-      <w:r>
-        <w:rPr>
-          <w:sz w:val="16"/>
-        </w:rPr>
-        <w:t>: 10.1145/3097983.3098126.</w:t>
+        <w:t>[7] E. Choi, M. T. Bahadori, L. Song, W. F. Stewart, and J. Sun, "GRAM: Graph-based attention model for healthcare representation learning," in Proc. 23rd ACM SIGKDD Int. Conf. Knowledge Discovery and Data Mining, 2017, pp. 787–795, doi: 10.1145/3097983.3098126.</w:t>
       </w:r>
     </w:p>
     <w:p>
@@ -13064,35 +12014,7 @@
         <w:rPr>
           <w:sz w:val="16"/>
         </w:rPr>
-        <w:t xml:space="preserve">[8] Y. Gu et al., "Domain-specific language model pretraining for biomedical natural language processing," ACM Trans. </w:t>
-      </w:r>
-      <w:proofErr w:type="spellStart"/>
-      <w:r>
-        <w:rPr>
-          <w:sz w:val="16"/>
-        </w:rPr>
-        <w:t>Comput</w:t>
-      </w:r>
-      <w:proofErr w:type="spellEnd"/>
-      <w:r>
-        <w:rPr>
-          <w:sz w:val="16"/>
-        </w:rPr>
-        <w:t xml:space="preserve">. Healthcare, vol. 3, no. 1, pp. 1–23, Jan. 2022, </w:t>
-      </w:r>
-      <w:proofErr w:type="spellStart"/>
-      <w:r>
-        <w:rPr>
-          <w:sz w:val="16"/>
-        </w:rPr>
-        <w:t>doi</w:t>
-      </w:r>
-      <w:proofErr w:type="spellEnd"/>
-      <w:r>
-        <w:rPr>
-          <w:sz w:val="16"/>
-        </w:rPr>
-        <w:t>: 10.1145/3458754.</w:t>
+        <w:t>[8] Y. Gu et al., "Domain-specific language model pretraining for biomedical natural language processing," ACM Trans. Comput. Healthcare, vol. 3, no. 1, pp. 1–23, Jan. 2022, doi: 10.1145/3458754.</w:t>
       </w:r>
     </w:p>
     <w:p>
@@ -13106,35 +12028,7 @@
         <w:rPr>
           <w:sz w:val="16"/>
         </w:rPr>
-        <w:t xml:space="preserve">[9] F. Liu, E. Shareghi, Z. Meng, M. </w:t>
-      </w:r>
-      <w:proofErr w:type="spellStart"/>
-      <w:r>
-        <w:rPr>
-          <w:sz w:val="16"/>
-        </w:rPr>
-        <w:t>Basaldella</w:t>
-      </w:r>
-      <w:proofErr w:type="spellEnd"/>
-      <w:r>
-        <w:rPr>
-          <w:sz w:val="16"/>
-        </w:rPr>
-        <w:t xml:space="preserve">, and N. Collier, "Self-alignment pretraining for biomedical entity representations," in Proc. Conf. North American Chapter Assoc. Computational Linguistics: Human Language Technologies, 2021, pp. 4228–4238, </w:t>
-      </w:r>
-      <w:proofErr w:type="spellStart"/>
-      <w:r>
-        <w:rPr>
-          <w:sz w:val="16"/>
-        </w:rPr>
-        <w:t>doi</w:t>
-      </w:r>
-      <w:proofErr w:type="spellEnd"/>
-      <w:r>
-        <w:rPr>
-          <w:sz w:val="16"/>
-        </w:rPr>
-        <w:t>: 10.18653/v1/2021.naacl-main.334.</w:t>
+        <w:t>[9] F. Liu, E. Shareghi, Z. Meng, M. Basaldella, and N. Collier, "Self-alignment pretraining for biomedical entity representations," in Proc. Conf. North American Chapter Assoc. Computational Linguistics: Human Language Technologies, 2021, pp. 4228–4238, doi: 10.18653/v1/2021.naacl-main.334.</w:t>
       </w:r>
     </w:p>
     <w:p>
@@ -13176,77 +12070,7 @@
         <w:rPr>
           <w:sz w:val="16"/>
         </w:rPr>
-        <w:t xml:space="preserve">[12] C. Lee, W. R. </w:t>
-      </w:r>
-      <w:proofErr w:type="spellStart"/>
-      <w:r>
-        <w:rPr>
-          <w:sz w:val="16"/>
-        </w:rPr>
-        <w:t>Zame</w:t>
-      </w:r>
-      <w:proofErr w:type="spellEnd"/>
-      <w:r>
-        <w:rPr>
-          <w:sz w:val="16"/>
-        </w:rPr>
-        <w:t>, J. Yoon, and M. van der Schaar, "</w:t>
-      </w:r>
-      <w:proofErr w:type="spellStart"/>
-      <w:r>
-        <w:rPr>
-          <w:sz w:val="16"/>
-        </w:rPr>
-        <w:t>DeepHit</w:t>
-      </w:r>
-      <w:proofErr w:type="spellEnd"/>
-      <w:r>
-        <w:rPr>
-          <w:sz w:val="16"/>
-        </w:rPr>
-        <w:t xml:space="preserve">: A deep learning approach to survival analysis with competing risks," in Proc. AAAI Conf. </w:t>
-      </w:r>
-      <w:proofErr w:type="spellStart"/>
-      <w:r>
-        <w:rPr>
-          <w:sz w:val="16"/>
-        </w:rPr>
-        <w:t>Artif</w:t>
-      </w:r>
-      <w:proofErr w:type="spellEnd"/>
-      <w:r>
-        <w:rPr>
-          <w:sz w:val="16"/>
-        </w:rPr>
-        <w:t xml:space="preserve">. Intell., vol. 32, no. 1, 2018, </w:t>
-      </w:r>
-      <w:proofErr w:type="spellStart"/>
-      <w:r>
-        <w:rPr>
-          <w:sz w:val="16"/>
-        </w:rPr>
-        <w:t>doi</w:t>
-      </w:r>
-      <w:proofErr w:type="spellEnd"/>
-      <w:r>
-        <w:rPr>
-          <w:sz w:val="16"/>
-        </w:rPr>
-        <w:t>: 10.1609/</w:t>
-      </w:r>
-      <w:proofErr w:type="gramStart"/>
-      <w:r>
-        <w:rPr>
-          <w:sz w:val="16"/>
-        </w:rPr>
-        <w:t>aaai.v</w:t>
-      </w:r>
-      <w:proofErr w:type="gramEnd"/>
-      <w:r>
-        <w:rPr>
-          <w:sz w:val="16"/>
-        </w:rPr>
-        <w:t>32i1.11842.</w:t>
+        <w:t>[12] C. Lee, W. R. Zame, J. Yoon, and M. van der Schaar, "DeepHit: A deep learning approach to survival analysis with competing risks," in Proc. AAAI Conf. Artif. Intell., vol. 32, no. 1, 2018, doi: 10.1609/aaai.v32i1.11842.</w:t>
       </w:r>
     </w:p>
     <w:p>
@@ -13260,35 +12084,7 @@
         <w:rPr>
           <w:sz w:val="16"/>
         </w:rPr>
-        <w:t>[13] C. Lee, J. Yoon, and M. van der Schaar, "Dynamic-</w:t>
-      </w:r>
-      <w:proofErr w:type="spellStart"/>
-      <w:r>
-        <w:rPr>
-          <w:sz w:val="16"/>
-        </w:rPr>
-        <w:t>DeepHit</w:t>
-      </w:r>
-      <w:proofErr w:type="spellEnd"/>
-      <w:r>
-        <w:rPr>
-          <w:sz w:val="16"/>
-        </w:rPr>
-        <w:t xml:space="preserve">: A deep learning approach for dynamic survival analysis with competing risks based on longitudinal data," IEEE Trans. Biomed. Eng., vol. 67, no. 1, pp. 122–133, Jan. 2020, </w:t>
-      </w:r>
-      <w:proofErr w:type="spellStart"/>
-      <w:r>
-        <w:rPr>
-          <w:sz w:val="16"/>
-        </w:rPr>
-        <w:t>doi</w:t>
-      </w:r>
-      <w:proofErr w:type="spellEnd"/>
-      <w:r>
-        <w:rPr>
-          <w:sz w:val="16"/>
-        </w:rPr>
-        <w:t>: 10.1109/TBME.2019.2909027.</w:t>
+        <w:t>[13] C. Lee, J. Yoon, and M. van der Schaar, "Dynamic-DeepHit: A deep learning approach for dynamic survival analysis with competing risks based on longitudinal data," IEEE Trans. Biomed. Eng., vol. 67, no. 1, pp. 122–133, Jan. 2020, doi: 10.1109/TBME.2019.2909027.</w:t>
       </w:r>
     </w:p>
     <w:p>
@@ -13302,35 +12098,7 @@
         <w:rPr>
           <w:sz w:val="16"/>
         </w:rPr>
-        <w:t>[14] Z. Wang and J. Sun, "</w:t>
-      </w:r>
-      <w:proofErr w:type="spellStart"/>
-      <w:r>
-        <w:rPr>
-          <w:sz w:val="16"/>
-        </w:rPr>
-        <w:t>SurvTRACE</w:t>
-      </w:r>
-      <w:proofErr w:type="spellEnd"/>
-      <w:r>
-        <w:rPr>
-          <w:sz w:val="16"/>
-        </w:rPr>
-        <w:t xml:space="preserve">: Transformers for survival analysis with competing events," in Proc. 13th ACM Int. Conf. Bioinformatics, Computational Biology and Health Informatics (ACM-BCB), 2022, pp. 1–9, </w:t>
-      </w:r>
-      <w:proofErr w:type="spellStart"/>
-      <w:r>
-        <w:rPr>
-          <w:sz w:val="16"/>
-        </w:rPr>
-        <w:t>doi</w:t>
-      </w:r>
-      <w:proofErr w:type="spellEnd"/>
-      <w:r>
-        <w:rPr>
-          <w:sz w:val="16"/>
-        </w:rPr>
-        <w:t>: 10.1145/3535508.3545521.</w:t>
+        <w:t>[14] Z. Wang and J. Sun, "SurvTRACE: Transformers for survival analysis with competing events," in Proc. 13th ACM Int. Conf. Bioinformatics, Computational Biology and Health Informatics (ACM-BCB), 2022, pp. 1–9, doi: 10.1145/3535508.3545521.</w:t>
       </w:r>
     </w:p>
     <w:p>
@@ -13344,49 +12112,7 @@
         <w:rPr>
           <w:sz w:val="16"/>
         </w:rPr>
-        <w:t xml:space="preserve">[15] H. Shinohara et al., "The potential of the transformer-based survival analysis model, </w:t>
-      </w:r>
-      <w:proofErr w:type="spellStart"/>
-      <w:r>
-        <w:rPr>
-          <w:sz w:val="16"/>
-        </w:rPr>
-        <w:t>SurvTrace</w:t>
-      </w:r>
-      <w:proofErr w:type="spellEnd"/>
-      <w:r>
-        <w:rPr>
-          <w:sz w:val="16"/>
-        </w:rPr>
-        <w:t xml:space="preserve">, for predicting recurrent cardiovascular events and stratifying high-risk patients with ischemic heart disease," </w:t>
-      </w:r>
-      <w:proofErr w:type="spellStart"/>
-      <w:r>
-        <w:rPr>
-          <w:sz w:val="16"/>
-        </w:rPr>
-        <w:t>PLoS</w:t>
-      </w:r>
-      <w:proofErr w:type="spellEnd"/>
-      <w:r>
-        <w:rPr>
-          <w:sz w:val="16"/>
-        </w:rPr>
-        <w:t xml:space="preserve"> One, vol. 19, no. 6, Art. no. e0304423, 2024, </w:t>
-      </w:r>
-      <w:proofErr w:type="spellStart"/>
-      <w:r>
-        <w:rPr>
-          <w:sz w:val="16"/>
-        </w:rPr>
-        <w:t>doi</w:t>
-      </w:r>
-      <w:proofErr w:type="spellEnd"/>
-      <w:r>
-        <w:rPr>
-          <w:sz w:val="16"/>
-        </w:rPr>
-        <w:t>: 10.1371/journal.pone.0304423.</w:t>
+        <w:t>[15] H. Shinohara et al., "The potential of the transformer-based survival analysis model, SurvTrace, for predicting recurrent cardiovascular events and stratifying high-risk patients with ischemic heart disease," PLoS One, vol. 19, no. 6, Art. no. e0304423, 2024, doi: 10.1371/journal.pone.0304423.</w:t>
       </w:r>
     </w:p>
     <w:p>
@@ -13411,35 +12137,14 @@
         <w:rPr>
           <w:sz w:val="16"/>
         </w:rPr>
-        <w:t>[17] J. Luo, M. Ye, C. Xiao, and F. Ma, "</w:t>
-      </w:r>
-      <w:proofErr w:type="spellStart"/>
+        <w:t xml:space="preserve">[17] J. Luo, M. Ye, C. Xiao, and F. Ma, "HiTANet: Hierarchical time-aware attention networks for risk prediction on electronic health records," in </w:t>
+      </w:r>
       <w:r>
         <w:rPr>
           <w:sz w:val="16"/>
         </w:rPr>
-        <w:t>HiTANet</w:t>
-      </w:r>
-      <w:proofErr w:type="spellEnd"/>
-      <w:r>
-        <w:rPr>
-          <w:sz w:val="16"/>
-        </w:rPr>
-        <w:t xml:space="preserve">: Hierarchical time-aware attention networks for risk prediction on electronic health records," in Proc. 26th ACM SIGKDD Int. Conf. Knowledge Discovery and Data Mining, 2020, pp. 647–656, </w:t>
-      </w:r>
-      <w:proofErr w:type="spellStart"/>
-      <w:r>
-        <w:rPr>
-          <w:sz w:val="16"/>
-        </w:rPr>
-        <w:t>doi</w:t>
-      </w:r>
-      <w:proofErr w:type="spellEnd"/>
-      <w:r>
-        <w:rPr>
-          <w:sz w:val="16"/>
-        </w:rPr>
-        <w:t>: 10.1145/3394486.3403107.</w:t>
+        <w:lastRenderedPageBreak/>
+        <w:t>Proc. 26th ACM SIGKDD Int. Conf. Knowledge Discovery and Data Mining, 2020, pp. 647–656, doi: 10.1145/3394486.3403107.</w:t>
       </w:r>
     </w:p>
     <w:p>
@@ -13453,63 +12158,7 @@
         <w:rPr>
           <w:sz w:val="16"/>
         </w:rPr>
-        <w:t xml:space="preserve">[18] P. </w:t>
-      </w:r>
-      <w:proofErr w:type="spellStart"/>
-      <w:r>
-        <w:rPr>
-          <w:sz w:val="16"/>
-        </w:rPr>
-        <w:t>Renc</w:t>
-      </w:r>
-      <w:proofErr w:type="spellEnd"/>
-      <w:r>
-        <w:rPr>
-          <w:sz w:val="16"/>
-        </w:rPr>
-        <w:t xml:space="preserve"> et al., "Foundation model of electronic medical records for adaptive risk estimation," </w:t>
-      </w:r>
-      <w:proofErr w:type="spellStart"/>
-      <w:r>
-        <w:rPr>
-          <w:sz w:val="16"/>
-        </w:rPr>
-        <w:t>GigaScience</w:t>
-      </w:r>
-      <w:proofErr w:type="spellEnd"/>
-      <w:r>
-        <w:rPr>
-          <w:sz w:val="16"/>
-        </w:rPr>
-        <w:t xml:space="preserve">, vol. 14, Art. no. giaf107, 2025, </w:t>
-      </w:r>
-      <w:proofErr w:type="spellStart"/>
-      <w:r>
-        <w:rPr>
-          <w:sz w:val="16"/>
-        </w:rPr>
-        <w:t>doi</w:t>
-      </w:r>
-      <w:proofErr w:type="spellEnd"/>
-      <w:r>
-        <w:rPr>
-          <w:sz w:val="16"/>
-        </w:rPr>
-        <w:t>: 10.1093/</w:t>
-      </w:r>
-      <w:proofErr w:type="spellStart"/>
-      <w:r>
-        <w:rPr>
-          <w:sz w:val="16"/>
-        </w:rPr>
-        <w:t>gigascience</w:t>
-      </w:r>
-      <w:proofErr w:type="spellEnd"/>
-      <w:r>
-        <w:rPr>
-          <w:sz w:val="16"/>
-        </w:rPr>
-        <w:t>/giaf107.</w:t>
+        <w:t>[18] P. Renc et al., "Foundation model of electronic medical records for adaptive risk estimation," GigaScience, vol. 14, Art. no. giaf107, 2025, doi: 10.1093/gigascience/giaf107.</w:t>
       </w:r>
     </w:p>
     <w:p>
@@ -13550,35 +12199,7 @@
         <w:rPr>
           <w:sz w:val="16"/>
         </w:rPr>
-        <w:t>[21] J. Su, M. Ahmed, Y. Lu, S. Pan, W. Bo, and Y. Liu, "</w:t>
-      </w:r>
-      <w:proofErr w:type="spellStart"/>
-      <w:r>
-        <w:rPr>
-          <w:sz w:val="16"/>
-        </w:rPr>
-        <w:t>RoFormer</w:t>
-      </w:r>
-      <w:proofErr w:type="spellEnd"/>
-      <w:r>
-        <w:rPr>
-          <w:sz w:val="16"/>
-        </w:rPr>
-        <w:t xml:space="preserve">: Enhanced transformer with rotary position embedding," Neurocomputing, vol. 568, Art. no. 127063, 2024, </w:t>
-      </w:r>
-      <w:proofErr w:type="spellStart"/>
-      <w:r>
-        <w:rPr>
-          <w:sz w:val="16"/>
-        </w:rPr>
-        <w:t>doi</w:t>
-      </w:r>
-      <w:proofErr w:type="spellEnd"/>
-      <w:r>
-        <w:rPr>
-          <w:sz w:val="16"/>
-        </w:rPr>
-        <w:t>: 10.1016/j.neucom.2023.127063.</w:t>
+        <w:t>[21] J. Su, M. Ahmed, Y. Lu, S. Pan, W. Bo, and Y. Liu, "RoFormer: Enhanced transformer with rotary position embedding," Neurocomputing, vol. 568, Art. no. 127063, 2024, doi: 10.1016/j.neucom.2023.127063.</w:t>
       </w:r>
     </w:p>
     <w:p>
@@ -13594,119 +12215,39 @@
           <w:sz w:val="16"/>
           <w:szCs w:val="16"/>
         </w:rPr>
-        <w:t>[22] Z. Song, Q. Lu, H. Zhu, D. Buckeridge, and Y. Li, "</w:t>
-      </w:r>
-      <w:proofErr w:type="spellStart"/>
-      <w:r>
+        <w:t>[22] Z. Song, Q. Lu, H. Zhu, D. Buckeridge, and Y. Li, "TrajGPT: Irregular time-series representation learning of health trajectory," IEEE J. Biomed. Health Inform., vol. 30, no. 5, pp. 3888–3899, May 2026, doi: 10.1109/JBHI.2025.3620205.</w:t>
+      </w:r>
+    </w:p>
+    <w:p>
+      <w:pPr>
+        <w:ind w:left="260" w:hanging="260"/>
         <w:rPr>
           <w:sz w:val="16"/>
           <w:szCs w:val="16"/>
         </w:rPr>
-        <w:t>TrajGPT</w:t>
-      </w:r>
-      <w:proofErr w:type="spellEnd"/>
+      </w:pPr>
       <w:r>
         <w:rPr>
           <w:sz w:val="16"/>
           <w:szCs w:val="16"/>
         </w:rPr>
-        <w:t xml:space="preserve">: Irregular time-series representation learning of health trajectory," IEEE J. Biomed. Health Inform., vol. 30, no. 5, pp. 3888–3899, May 2026, </w:t>
-      </w:r>
-      <w:proofErr w:type="spellStart"/>
-      <w:r>
+        <w:t>[23] C. Sudlow et al., "UK Biobank: An open access resource for identifying the causes of a wide range of complex diseases of middle and old age," PLoS Med., vol. 12, no. 3, Art. no. e1001779, 2015, doi: 10.1371/journal.pmed.1001779.</w:t>
+      </w:r>
+    </w:p>
+    <w:p>
+      <w:pPr>
+        <w:ind w:left="260" w:hanging="260"/>
         <w:rPr>
           <w:sz w:val="16"/>
           <w:szCs w:val="16"/>
         </w:rPr>
-        <w:t>doi</w:t>
-      </w:r>
-      <w:proofErr w:type="spellEnd"/>
+      </w:pPr>
       <w:r>
         <w:rPr>
           <w:sz w:val="16"/>
           <w:szCs w:val="16"/>
         </w:rPr>
-        <w:t>: 10.1109/JBHI.2025.3620205.</w:t>
-      </w:r>
-    </w:p>
-    <w:p>
-      <w:pPr>
-        <w:ind w:left="260" w:hanging="260"/>
-        <w:rPr>
-          <w:sz w:val="16"/>
-          <w:szCs w:val="16"/>
-        </w:rPr>
-      </w:pPr>
-      <w:r>
-        <w:rPr>
-          <w:sz w:val="16"/>
-          <w:szCs w:val="16"/>
-        </w:rPr>
-        <w:t xml:space="preserve">[23] C. Sudlow et al., "UK Biobank: An open access resource for identifying the causes of a wide range of complex diseases of middle and old age," </w:t>
-      </w:r>
-      <w:proofErr w:type="spellStart"/>
-      <w:r>
-        <w:rPr>
-          <w:sz w:val="16"/>
-          <w:szCs w:val="16"/>
-        </w:rPr>
-        <w:t>PLoS</w:t>
-      </w:r>
-      <w:proofErr w:type="spellEnd"/>
-      <w:r>
-        <w:rPr>
-          <w:sz w:val="16"/>
-          <w:szCs w:val="16"/>
-        </w:rPr>
-        <w:t xml:space="preserve"> Med., vol. 12, no. 3, Art. no. e1001779, 2015, </w:t>
-      </w:r>
-      <w:proofErr w:type="spellStart"/>
-      <w:r>
-        <w:rPr>
-          <w:sz w:val="16"/>
-          <w:szCs w:val="16"/>
-        </w:rPr>
-        <w:t>doi</w:t>
-      </w:r>
-      <w:proofErr w:type="spellEnd"/>
-      <w:r>
-        <w:rPr>
-          <w:sz w:val="16"/>
-          <w:szCs w:val="16"/>
-        </w:rPr>
-        <w:t>: 10.1371/journal.pmed.1001779.</w:t>
-      </w:r>
-    </w:p>
-    <w:p>
-      <w:pPr>
-        <w:ind w:left="260" w:hanging="260"/>
-        <w:rPr>
-          <w:sz w:val="16"/>
-          <w:szCs w:val="16"/>
-        </w:rPr>
-      </w:pPr>
-      <w:r>
-        <w:rPr>
-          <w:sz w:val="16"/>
-          <w:szCs w:val="16"/>
-        </w:rPr>
-        <w:t xml:space="preserve">[24] A. E. W. Johnson et al., "MIMIC-IV, a freely accessible electronic health record dataset," Sci. Data, vol. 10, Art. no. 1, 2023, </w:t>
-      </w:r>
-      <w:proofErr w:type="spellStart"/>
-      <w:r>
-        <w:rPr>
-          <w:sz w:val="16"/>
-          <w:szCs w:val="16"/>
-        </w:rPr>
-        <w:t>doi</w:t>
-      </w:r>
-      <w:proofErr w:type="spellEnd"/>
-      <w:r>
-        <w:rPr>
-          <w:sz w:val="16"/>
-          <w:szCs w:val="16"/>
-        </w:rPr>
-        <w:t>: 10.1038/s41597-022-01899-x.</w:t>
+        <w:t>[24] A. E. W. Johnson et al., "MIMIC-IV, a freely accessible electronic health record dataset," Sci. Data, vol. 10, Art. no. 1, 2023, doi: 10.1038/s41597-022-01899-x.</w:t>
       </w:r>
     </w:p>
     <w:sectPr>
@@ -15721,6 +14262,7 @@
   <w:style w:type="character" w:default="1" w:styleId="a0">
     <w:name w:val="Default Paragraph Font"/>
     <w:uiPriority w:val="1"/>
+    <w:semiHidden/>
     <w:unhideWhenUsed/>
   </w:style>
   <w:style w:type="table" w:default="1" w:styleId="a1">

</xml_diff>